<commit_message>
Modified the csproj and json file
</commit_message>
<xml_diff>
--- a/Scripts/Template.docx
+++ b/Scripts/Template.docx
@@ -48,7 +48,6 @@
           <w:color w:val="000000" w:themeColor="text1"/>
           <w:sz w:val="36"/>
           <w:szCs w:val="36"/>
-          <w:highlight w:val="red"/>
         </w:rPr>
         <w:t>ADD_DOC_RECORD</w:t>
       </w:r>
@@ -94,7 +93,6 @@
           <w:bCs/>
           <w:sz w:val="36"/>
           <w:szCs w:val="36"/>
-          <w:highlight w:val="darkRed"/>
         </w:rPr>
         <w:t>ADD_STD_NAME</w:t>
       </w:r>
@@ -162,14 +160,12 @@
       <w:r>
         <w:rPr>
           <w:b/>
-          <w:highlight w:val="green"/>
         </w:rPr>
         <w:t>ADD_PLAN</w:t>
       </w:r>
       <w:r>
         <w:rPr>
           <w:b/>
-          <w:highlight w:val="green"/>
         </w:rPr>
         <w:t>_NUMBER</w:t>
       </w:r>
@@ -188,13 +184,7 @@
         <w:rPr>
           <w:b/>
         </w:rPr>
-        <w:t>PD Plan:</w:t>
-      </w:r>
-      <w:r>
-        <w:rPr>
-          <w:b/>
-        </w:rPr>
-        <w:t xml:space="preserve"> </w:t>
+        <w:t xml:space="preserve">PD Plan: </w:t>
       </w:r>
       <w:r>
         <w:rPr>
@@ -205,7 +195,6 @@
       <w:r>
         <w:rPr>
           <w:b/>
-          <w:highlight w:val="green"/>
         </w:rPr>
         <w:t>ADD_PLAN_NUMBER</w:t>
       </w:r>
@@ -246,7 +235,6 @@
         <w:rPr>
           <w:b/>
           <w:color w:val="auto"/>
-          <w:highlight w:val="cyan"/>
         </w:rPr>
         <w:t>ADD_PREPARED_BY</w:t>
       </w:r>
@@ -270,7 +258,6 @@
         <w:rPr>
           <w:b/>
           <w:color w:val="auto"/>
-          <w:highlight w:val="cyan"/>
         </w:rPr>
         <w:t>ADD_PREPARED_BY</w:t>
       </w:r>
@@ -295,7 +282,6 @@
           <w:b/>
           <w:bCs/>
           <w:color w:val="000000" w:themeColor="text1"/>
-          <w:highlight w:val="yellow"/>
         </w:rPr>
         <w:t>ADD_PROTOCOL_NUMBER#</w:t>
       </w:r>
@@ -305,7 +291,7 @@
           <w:bCs/>
           <w:color w:val="000000" w:themeColor="text1"/>
         </w:rPr>
-        <w:t xml:space="preserve"> </w:t>
+        <w:t xml:space="preserve"> ADD_</w:t>
       </w:r>
       <w:r>
         <w:rPr>
@@ -313,7 +299,7 @@
           <w:bCs/>
           <w:color w:val="000000" w:themeColor="text1"/>
         </w:rPr>
-        <w:t>ADD_DOC_STX</w:t>
+        <w:t>DOC_STX</w:t>
       </w:r>
     </w:p>
     <w:p>
@@ -758,15 +744,11 @@
               </w:rPr>
             </w:pPr>
             <w:r>
-              <w:t>DSWP</w:t>
-            </w:r>
-            <w:r>
-              <w:t>-</w:t>
-            </w:r>
-            <w:r>
-              <w:rPr>
-                <w:b/>
-                <w:highlight w:val="green"/>
+              <w:t>DSWP-</w:t>
+            </w:r>
+            <w:r>
+              <w:rPr>
+                <w:b/>
               </w:rPr>
               <w:t>ADD_PLAN_NUMBER</w:t>
             </w:r>
@@ -818,7 +800,6 @@
             </w:pPr>
             <w:r>
               <w:rPr>
-                <w:highlight w:val="magenta"/>
                 <w:lang w:bidi="he-IL"/>
               </w:rPr>
               <w:t>ADD_DOC_STD#</w:t>
@@ -841,13 +822,7 @@
               <w:spacing w:before="20" w:after="20"/>
             </w:pPr>
             <w:r>
-              <w:t xml:space="preserve">Software Verification Test </w:t>
-            </w:r>
-            <w:r>
-              <w:rPr>
-                <w:highlight w:val="red"/>
-              </w:rPr>
-              <w:t>ADD_DOC_RECORD</w:t>
+              <w:t>Software Verification Test ADD_DOC_RECORD</w:t>
             </w:r>
             <w:r>
               <w:t xml:space="preserve"> </w:t>
@@ -874,27 +849,23 @@
             <w:pPr>
               <w:spacing w:before="20" w:after="20"/>
               <w:rPr>
-                <w:highlight w:val="magenta"/>
                 <w:lang w:bidi="he-IL"/>
               </w:rPr>
             </w:pPr>
             <w:r>
               <w:rPr>
-                <w:highlight w:val="magenta"/>
                 <w:lang w:bidi="he-IL"/>
               </w:rPr>
               <w:t>ADD_</w:t>
             </w:r>
             <w:r>
               <w:rPr>
-                <w:highlight w:val="magenta"/>
                 <w:lang w:bidi="he-IL"/>
               </w:rPr>
               <w:t>PROTOCOL_NUMBER</w:t>
             </w:r>
             <w:r>
               <w:rPr>
-                <w:highlight w:val="magenta"/>
                 <w:lang w:bidi="he-IL"/>
               </w:rPr>
               <w:t>#</w:t>
@@ -929,10 +900,7 @@
               <w:t xml:space="preserve"> </w:t>
             </w:r>
             <w:r>
-              <w:t>TO_BE_DELETED</w:t>
-            </w:r>
-            <w:r>
-              <w:t>_ROW</w:t>
+              <w:t>TO_BE_DELETED_ROW</w:t>
             </w:r>
           </w:p>
         </w:tc>
@@ -1049,7 +1017,7 @@
           </w:tcPr>
           <w:p>
             <w:pPr>
-              <w:pStyle w:val="a3"/>
+              <w:pStyle w:val="Header"/>
               <w:rPr>
                 <w:b/>
               </w:rPr>
@@ -1071,7 +1039,7 @@
           </w:tcPr>
           <w:p>
             <w:pPr>
-              <w:pStyle w:val="a3"/>
+              <w:pStyle w:val="Header"/>
             </w:pPr>
             <w:r>
               <w:rPr>
@@ -1083,16 +1051,16 @@
           </w:p>
           <w:p>
             <w:pPr>
-              <w:pStyle w:val="a3"/>
-              <w:rPr>
-                <w:b/>
-                <w:bCs/>
-              </w:rPr>
-            </w:pPr>
-          </w:p>
-          <w:p>
-            <w:pPr>
-              <w:pStyle w:val="a3"/>
+              <w:pStyle w:val="Header"/>
+              <w:rPr>
+                <w:b/>
+                <w:bCs/>
+              </w:rPr>
+            </w:pPr>
+          </w:p>
+          <w:p>
+            <w:pPr>
+              <w:pStyle w:val="Header"/>
               <w:rPr>
                 <w:b/>
                 <w:bCs/>
@@ -1106,7 +1074,7 @@
           </w:tcPr>
           <w:p>
             <w:pPr>
-              <w:pStyle w:val="a3"/>
+              <w:pStyle w:val="Header"/>
               <w:rPr>
                 <w:b/>
               </w:rPr>
@@ -1125,7 +1093,7 @@
           </w:tcPr>
           <w:p>
             <w:pPr>
-              <w:pStyle w:val="a3"/>
+              <w:pStyle w:val="Header"/>
               <w:rPr>
                 <w:b/>
               </w:rPr>
@@ -1144,7 +1112,7 @@
           </w:tcPr>
           <w:p>
             <w:pPr>
-              <w:pStyle w:val="a3"/>
+              <w:pStyle w:val="Header"/>
               <w:rPr>
                 <w:b/>
               </w:rPr>
@@ -1158,23 +1126,23 @@
           </w:p>
           <w:p>
             <w:pPr>
-              <w:pStyle w:val="a3"/>
-              <w:rPr>
-                <w:b/>
-              </w:rPr>
-            </w:pPr>
-          </w:p>
-          <w:p>
-            <w:pPr>
-              <w:pStyle w:val="a3"/>
-              <w:rPr>
-                <w:b/>
-              </w:rPr>
-            </w:pPr>
-          </w:p>
-          <w:p>
-            <w:pPr>
-              <w:pStyle w:val="a3"/>
+              <w:pStyle w:val="Header"/>
+              <w:rPr>
+                <w:b/>
+              </w:rPr>
+            </w:pPr>
+          </w:p>
+          <w:p>
+            <w:pPr>
+              <w:pStyle w:val="Header"/>
+              <w:rPr>
+                <w:b/>
+              </w:rPr>
+            </w:pPr>
+          </w:p>
+          <w:p>
+            <w:pPr>
+              <w:pStyle w:val="Header"/>
               <w:rPr>
                 <w:b/>
               </w:rPr>
@@ -1188,23 +1156,23 @@
           </w:p>
           <w:p>
             <w:pPr>
-              <w:pStyle w:val="a3"/>
-              <w:rPr>
-                <w:b/>
-              </w:rPr>
-            </w:pPr>
-          </w:p>
-          <w:p>
-            <w:pPr>
-              <w:pStyle w:val="a3"/>
-              <w:rPr>
-                <w:b/>
-              </w:rPr>
-            </w:pPr>
-          </w:p>
-          <w:p>
-            <w:pPr>
-              <w:pStyle w:val="a3"/>
+              <w:pStyle w:val="Header"/>
+              <w:rPr>
+                <w:b/>
+              </w:rPr>
+            </w:pPr>
+          </w:p>
+          <w:p>
+            <w:pPr>
+              <w:pStyle w:val="Header"/>
+              <w:rPr>
+                <w:b/>
+              </w:rPr>
+            </w:pPr>
+          </w:p>
+          <w:p>
+            <w:pPr>
+              <w:pStyle w:val="Header"/>
               <w:rPr>
                 <w:b/>
               </w:rPr>
@@ -1226,7 +1194,7 @@
           </w:tcPr>
           <w:p>
             <w:pPr>
-              <w:pStyle w:val="a3"/>
+              <w:pStyle w:val="Header"/>
               <w:rPr>
                 <w:b/>
               </w:rPr>
@@ -1248,7 +1216,7 @@
           </w:tcPr>
           <w:p>
             <w:pPr>
-              <w:pStyle w:val="a3"/>
+              <w:pStyle w:val="Header"/>
             </w:pPr>
             <w:r>
               <w:rPr>
@@ -1260,7 +1228,7 @@
           </w:p>
           <w:p>
             <w:pPr>
-              <w:pStyle w:val="a3"/>
+              <w:pStyle w:val="Header"/>
               <w:rPr>
                 <w:b/>
                 <w:bCs/>
@@ -1274,7 +1242,7 @@
           </w:tcPr>
           <w:p>
             <w:pPr>
-              <w:pStyle w:val="a3"/>
+              <w:pStyle w:val="Header"/>
               <w:rPr>
                 <w:b/>
               </w:rPr>
@@ -1293,7 +1261,7 @@
           </w:tcPr>
           <w:p>
             <w:pPr>
-              <w:pStyle w:val="a3"/>
+              <w:pStyle w:val="Header"/>
               <w:rPr>
                 <w:b/>
               </w:rPr>
@@ -1312,7 +1280,7 @@
           </w:tcPr>
           <w:p>
             <w:pPr>
-              <w:pStyle w:val="a3"/>
+              <w:pStyle w:val="Header"/>
               <w:rPr>
                 <w:b/>
               </w:rPr>
@@ -1332,7 +1300,7 @@
           </w:p>
           <w:p>
             <w:pPr>
-              <w:pStyle w:val="a3"/>
+              <w:pStyle w:val="Header"/>
             </w:pPr>
             <w:r>
               <w:fldChar w:fldCharType="begin">
@@ -1362,12 +1330,12 @@
           </w:p>
           <w:p>
             <w:pPr>
-              <w:pStyle w:val="a3"/>
-            </w:pPr>
-          </w:p>
-          <w:p>
-            <w:pPr>
-              <w:pStyle w:val="a3"/>
+              <w:pStyle w:val="Header"/>
+            </w:pPr>
+          </w:p>
+          <w:p>
+            <w:pPr>
+              <w:pStyle w:val="Header"/>
             </w:pPr>
             <w:r>
               <w:fldChar w:fldCharType="begin">
@@ -1397,12 +1365,12 @@
           </w:p>
           <w:p>
             <w:pPr>
-              <w:pStyle w:val="a3"/>
-            </w:pPr>
-          </w:p>
-          <w:p>
-            <w:pPr>
-              <w:pStyle w:val="a3"/>
+              <w:pStyle w:val="Header"/>
+            </w:pPr>
+          </w:p>
+          <w:p>
+            <w:pPr>
+              <w:pStyle w:val="Header"/>
               <w:rPr>
                 <w:b/>
               </w:rPr>
@@ -1498,7 +1466,6 @@
       <w:r>
         <w:rPr>
           <w:color w:val="000000" w:themeColor="text1"/>
-          <w:highlight w:val="yellow"/>
         </w:rPr>
         <w:t>ADD_PROTOCOL_NUMBER#</w:t>
       </w:r>
@@ -1559,7 +1526,7 @@
     </w:p>
     <w:tbl>
       <w:tblPr>
-        <w:tblStyle w:val="a7"/>
+        <w:tblStyle w:val="TableGrid"/>
         <w:tblW w:w="5000" w:type="pct"/>
         <w:jc w:val="center"/>
         <w:tblLook w:val="04A0" w:firstRow="1" w:lastRow="0" w:firstColumn="1" w:lastColumn="0" w:noHBand="0" w:noVBand="1"/>
@@ -4457,7 +4424,6 @@
             <w:r>
               <w:rPr>
                 <w:b/>
-                <w:highlight w:val="cyan"/>
               </w:rPr>
               <w:t>ADD_PREPARED_BY</w:t>
             </w:r>
@@ -4759,7 +4725,7 @@
 <w:hdr xmlns:wpc="http://schemas.microsoft.com/office/word/2010/wordprocessingCanvas" xmlns:cx="http://schemas.microsoft.com/office/drawing/2014/chartex" xmlns:cx1="http://schemas.microsoft.com/office/drawing/2015/9/8/chartex" xmlns:cx2="http://schemas.microsoft.com/office/drawing/2015/10/21/chartex" xmlns:cx3="http://schemas.microsoft.com/office/drawing/2016/5/9/chartex" xmlns:cx4="http://schemas.microsoft.com/office/drawing/2016/5/10/chartex" xmlns:cx5="http://schemas.microsoft.com/office/drawing/2016/5/11/chartex" xmlns:cx6="http://schemas.microsoft.com/office/drawing/2016/5/12/chartex" xmlns:cx7="http://schemas.microsoft.com/office/drawing/2016/5/13/chartex" xmlns:cx8="http://schemas.microsoft.com/office/drawing/2016/5/14/chartex" xmlns:mc="http://schemas.openxmlformats.org/markup-compatibility/2006" xmlns:aink="http://schemas.microsoft.com/office/drawing/2016/ink" xmlns:am3d="http://schemas.microsoft.com/office/drawing/2017/model3d" xmlns:o="urn:schemas-microsoft-com:office:office" xmlns:oel="http://schemas.microsoft.com/office/2019/extlst" xmlns:r="http://schemas.openxmlformats.org/officeDocument/2006/relationships" xmlns:m="http://schemas.openxmlformats.org/officeDocument/2006/math" xmlns:v="urn:schemas-microsoft-com:vml" xmlns:wp14="http://schemas.microsoft.com/office/word/2010/wordprocessingDrawing" xmlns:wp="http://schemas.openxmlformats.org/drawingml/2006/wordprocessingDrawing" xmlns:w10="urn:schemas-microsoft-com:office:word" xmlns:w="http://schemas.openxmlformats.org/wordprocessingml/2006/main" xmlns:w14="http://schemas.microsoft.com/office/word/2010/wordml" xmlns:w15="http://schemas.microsoft.com/office/word/2012/wordml" xmlns:w16cex="http://schemas.microsoft.com/office/word/2018/wordml/cex" xmlns:w16cid="http://schemas.microsoft.com/office/word/2016/wordml/cid" xmlns:w16="http://schemas.microsoft.com/office/word/2018/wordml" xmlns:w16du="http://schemas.microsoft.com/office/word/2023/wordml/word16du" xmlns:w16sdtdh="http://schemas.microsoft.com/office/word/2020/wordml/sdtdatahash" xmlns:w16sdtfl="http://schemas.microsoft.com/office/word/2024/wordml/sdtformatlock" xmlns:w16se="http://schemas.microsoft.com/office/word/2015/wordml/symex" xmlns:wpg="http://schemas.microsoft.com/office/word/2010/wordprocessingGroup" xmlns:wpi="http://schemas.microsoft.com/office/word/2010/wordprocessingInk" xmlns:wne="http://schemas.microsoft.com/office/word/2006/wordml" xmlns:wps="http://schemas.microsoft.com/office/word/2010/wordprocessingShape" mc:Ignorable="w14 w15 w16se w16cid w16 w16cex w16sdtdh w16sdtfl w16du wp14">
   <w:p>
     <w:pPr>
-      <w:pStyle w:val="a3"/>
+      <w:pStyle w:val="Header"/>
     </w:pPr>
   </w:p>
   <w:p/>
@@ -4866,7 +4832,7 @@
           <w:pPr>
             <w:jc w:val="center"/>
             <w:rPr>
-              <w:rFonts w:eastAsia="Times New Roman"/>
+              <w:rFonts w:asciiTheme="minorBidi" w:eastAsia="Times New Roman" w:hAnsiTheme="minorBidi" w:cstheme="minorBidi"/>
               <w:b/>
               <w:bCs/>
               <w:color w:val="auto"/>
@@ -4876,48 +4842,25 @@
           </w:pPr>
           <w:r>
             <w:rPr>
-              <w:rFonts w:eastAsia="Times New Roman"/>
+              <w:rFonts w:asciiTheme="minorBidi" w:eastAsia="Times New Roman" w:hAnsiTheme="minorBidi" w:cstheme="minorBidi"/>
               <w:b/>
               <w:bCs/>
               <w:color w:val="auto"/>
               <w:sz w:val="24"/>
               <w:szCs w:val="24"/>
             </w:rPr>
-            <w:t xml:space="preserve">Software Test </w:t>
+            <w:t>Software Test ADD_DOC_TYPE</w:t>
           </w:r>
           <w:r>
             <w:rPr>
-              <w:rFonts w:eastAsia="Times New Roman"/>
-              <w:b/>
-              <w:bCs/>
-              <w:color w:val="auto"/>
-              <w:sz w:val="24"/>
-              <w:szCs w:val="24"/>
-              <w:highlight w:val="yellow"/>
-            </w:rPr>
-            <w:t>ADD_DOC_TYPE</w:t>
-          </w:r>
-          <w:r>
-            <w:rPr>
-              <w:rFonts w:eastAsia="Times New Roman"/>
+              <w:rFonts w:asciiTheme="minorBidi" w:eastAsia="Times New Roman" w:hAnsiTheme="minorBidi" w:cstheme="minorBidi"/>
               <w:b/>
               <w:bCs/>
               <w:color w:val="auto"/>
               <w:sz w:val="24"/>
               <w:szCs w:val="24"/>
             </w:rPr>
-            <w:t xml:space="preserve"> </w:t>
-          </w:r>
-          <w:r>
-            <w:rPr>
-              <w:rFonts w:eastAsia="Times New Roman"/>
-              <w:b/>
-              <w:bCs/>
-              <w:color w:val="auto"/>
-              <w:sz w:val="24"/>
-              <w:szCs w:val="24"/>
-            </w:rPr>
-            <w:t>ADD_DOC_STX</w:t>
+            <w:t xml:space="preserve"> ADD_DOC_STX</w:t>
           </w:r>
         </w:p>
         <w:p>
@@ -4925,7 +4868,7 @@
             <w:spacing w:after="0"/>
             <w:jc w:val="center"/>
             <w:rPr>
-              <w:rFonts w:eastAsia="Times New Roman"/>
+              <w:rFonts w:asciiTheme="minorBidi" w:eastAsia="Times New Roman" w:hAnsiTheme="minorBidi" w:cstheme="minorBidi"/>
               <w:color w:val="auto"/>
               <w:sz w:val="18"/>
               <w:szCs w:val="18"/>
@@ -4941,14 +4884,15 @@
           <w:pPr>
             <w:jc w:val="right"/>
             <w:rPr>
-              <w:color w:val="FFFFFF" w:themeColor="background1"/>
+              <w:rFonts w:asciiTheme="minorBidi" w:hAnsiTheme="minorBidi" w:cstheme="minorBidi"/>
+              <w:color w:val="auto"/>
               <w:sz w:val="18"/>
               <w:szCs w:val="18"/>
             </w:rPr>
           </w:pPr>
           <w:r>
             <w:rPr>
-              <w:rFonts w:eastAsia="Times New Roman" w:hint="cs"/>
+              <w:rFonts w:asciiTheme="minorBidi" w:eastAsia="Times New Roman" w:hAnsiTheme="minorBidi" w:cstheme="minorBidi"/>
               <w:color w:val="auto"/>
               <w:sz w:val="18"/>
               <w:szCs w:val="18"/>
@@ -4959,6 +4903,8 @@
           </w:r>
           <w:r>
             <w:rPr>
+              <w:rFonts w:asciiTheme="minorBidi" w:hAnsiTheme="minorBidi" w:cstheme="minorBidi"/>
+              <w:color w:val="auto"/>
               <w:sz w:val="18"/>
               <w:szCs w:val="18"/>
             </w:rPr>
@@ -4966,63 +4912,60 @@
           </w:r>
           <w:r>
             <w:rPr>
-              <w:rFonts w:ascii="Aptos Narrow" w:hAnsi="Aptos Narrow"/>
-              <w:sz w:val="28"/>
-              <w:szCs w:val="28"/>
+              <w:rFonts w:asciiTheme="minorBidi" w:hAnsiTheme="minorBidi" w:cstheme="minorBidi"/>
+              <w:color w:val="auto"/>
+              <w:sz w:val="18"/>
+              <w:szCs w:val="18"/>
               <w:shd w:val="clear" w:color="auto" w:fill="FFFFFF"/>
             </w:rPr>
             <w:t xml:space="preserve"> </w:t>
           </w:r>
           <w:r>
             <w:rPr>
-              <w:rFonts w:ascii="Aptos Narrow" w:hAnsi="Aptos Narrow"/>
-              <w:color w:val="FFFFFF" w:themeColor="background1"/>
-              <w:sz w:val="28"/>
-              <w:szCs w:val="28"/>
-              <w:highlight w:val="darkMagenta"/>
+              <w:rFonts w:asciiTheme="minorBidi" w:hAnsiTheme="minorBidi" w:cstheme="minorBidi"/>
+              <w:color w:val="auto"/>
+              <w:sz w:val="18"/>
+              <w:szCs w:val="18"/>
               <w:shd w:val="clear" w:color="auto" w:fill="FFFFFF"/>
             </w:rPr>
             <w:t>ADD</w:t>
           </w:r>
           <w:r>
             <w:rPr>
-              <w:rFonts w:ascii="Aptos Narrow" w:hAnsi="Aptos Narrow"/>
-              <w:color w:val="FFFFFF" w:themeColor="background1"/>
-              <w:sz w:val="28"/>
-              <w:szCs w:val="28"/>
-              <w:highlight w:val="darkMagenta"/>
+              <w:rFonts w:asciiTheme="minorBidi" w:hAnsiTheme="minorBidi" w:cstheme="minorBidi"/>
+              <w:color w:val="auto"/>
+              <w:sz w:val="18"/>
+              <w:szCs w:val="18"/>
               <w:shd w:val="clear" w:color="auto" w:fill="FFFFFF"/>
             </w:rPr>
             <w:t>_</w:t>
           </w:r>
           <w:r>
             <w:rPr>
-              <w:rFonts w:ascii="Aptos Narrow" w:hAnsi="Aptos Narrow"/>
-              <w:color w:val="FFFFFF" w:themeColor="background1"/>
-              <w:sz w:val="28"/>
-              <w:szCs w:val="28"/>
-              <w:highlight w:val="darkMagenta"/>
+              <w:rFonts w:asciiTheme="minorBidi" w:hAnsiTheme="minorBidi" w:cstheme="minorBidi"/>
+              <w:color w:val="auto"/>
+              <w:sz w:val="18"/>
+              <w:szCs w:val="18"/>
               <w:shd w:val="clear" w:color="auto" w:fill="FFFFFF"/>
             </w:rPr>
             <w:t>DOC</w:t>
           </w:r>
           <w:r>
             <w:rPr>
-              <w:rFonts w:ascii="Aptos Narrow" w:hAnsi="Aptos Narrow"/>
-              <w:color w:val="FFFFFF" w:themeColor="background1"/>
-              <w:sz w:val="28"/>
-              <w:szCs w:val="28"/>
-              <w:highlight w:val="darkMagenta"/>
+              <w:rFonts w:asciiTheme="minorBidi" w:hAnsiTheme="minorBidi" w:cstheme="minorBidi"/>
+              <w:color w:val="auto"/>
+              <w:sz w:val="18"/>
+              <w:szCs w:val="18"/>
               <w:shd w:val="clear" w:color="auto" w:fill="FFFFFF"/>
             </w:rPr>
             <w:t>_STD#</w:t>
           </w:r>
           <w:r>
             <w:rPr>
-              <w:rFonts w:ascii="Aptos Narrow" w:hAnsi="Aptos Narrow"/>
+              <w:rFonts w:asciiTheme="minorBidi" w:hAnsiTheme="minorBidi" w:cstheme="minorBidi"/>
               <w:color w:val="auto"/>
-              <w:sz w:val="28"/>
-              <w:szCs w:val="28"/>
+              <w:sz w:val="18"/>
+              <w:szCs w:val="18"/>
               <w:shd w:val="clear" w:color="auto" w:fill="FFFFFF"/>
             </w:rPr>
             <w:t xml:space="preserve"> ADD_STX_NUMBER</w:t>
@@ -5032,7 +4975,9 @@
           <w:pPr>
             <w:jc w:val="right"/>
             <w:rPr>
+              <w:rFonts w:asciiTheme="minorBidi" w:hAnsiTheme="minorBidi" w:cstheme="minorBidi"/>
               <w:b/>
+              <w:color w:val="auto"/>
               <w:sz w:val="18"/>
               <w:szCs w:val="18"/>
               <w:lang w:eastAsia="ja-JP"/>
@@ -5040,7 +4985,9 @@
           </w:pPr>
           <w:r>
             <w:rPr>
+              <w:rFonts w:asciiTheme="minorBidi" w:hAnsiTheme="minorBidi" w:cstheme="minorBidi"/>
               <w:b/>
+              <w:color w:val="auto"/>
               <w:sz w:val="18"/>
               <w:szCs w:val="18"/>
               <w:lang w:eastAsia="ja-JP"/>
@@ -5049,8 +4996,10 @@
           </w:r>
           <w:r>
             <w:rPr>
+              <w:rFonts w:asciiTheme="minorBidi" w:hAnsiTheme="minorBidi" w:cstheme="minorBidi"/>
               <w:b/>
               <w:bCs/>
+              <w:color w:val="auto"/>
               <w:sz w:val="18"/>
               <w:szCs w:val="18"/>
               <w:lang w:eastAsia="ja-JP"/>
@@ -5059,8 +5008,10 @@
           </w:r>
           <w:r>
             <w:rPr>
+              <w:rFonts w:asciiTheme="minorBidi" w:hAnsiTheme="minorBidi" w:cstheme="minorBidi"/>
               <w:b/>
               <w:bCs/>
+              <w:color w:val="auto"/>
               <w:sz w:val="18"/>
               <w:szCs w:val="18"/>
               <w:lang w:eastAsia="ja-JP"/>
@@ -5069,8 +5020,10 @@
           </w:r>
           <w:r>
             <w:rPr>
+              <w:rFonts w:asciiTheme="minorBidi" w:hAnsiTheme="minorBidi" w:cstheme="minorBidi"/>
               <w:b/>
               <w:bCs/>
+              <w:color w:val="auto"/>
               <w:sz w:val="18"/>
               <w:szCs w:val="18"/>
               <w:lang w:eastAsia="ja-JP"/>
@@ -5079,6 +5032,8 @@
           </w:r>
           <w:r>
             <w:rPr>
+              <w:rFonts w:asciiTheme="minorBidi" w:hAnsiTheme="minorBidi" w:cstheme="minorBidi"/>
+              <w:color w:val="auto"/>
               <w:sz w:val="18"/>
               <w:szCs w:val="18"/>
               <w:lang w:eastAsia="ja-JP"/>
@@ -5087,6 +5042,8 @@
           </w:r>
           <w:r>
             <w:rPr>
+              <w:rFonts w:asciiTheme="minorBidi" w:hAnsiTheme="minorBidi" w:cstheme="minorBidi"/>
+              <w:color w:val="auto"/>
               <w:sz w:val="18"/>
               <w:szCs w:val="18"/>
               <w:lang w:eastAsia="ja-JP"/>
@@ -5095,7 +5052,9 @@
           </w:r>
           <w:r>
             <w:rPr>
+              <w:rFonts w:asciiTheme="minorBidi" w:hAnsiTheme="minorBidi" w:cstheme="minorBidi"/>
               <w:b/>
+              <w:color w:val="auto"/>
               <w:sz w:val="18"/>
               <w:szCs w:val="18"/>
               <w:lang w:eastAsia="ja-JP"/>
@@ -5104,8 +5063,10 @@
           </w:r>
           <w:r>
             <w:rPr>
+              <w:rFonts w:asciiTheme="minorBidi" w:hAnsiTheme="minorBidi" w:cstheme="minorBidi"/>
               <w:b/>
               <w:bCs/>
+              <w:color w:val="auto"/>
               <w:sz w:val="18"/>
               <w:szCs w:val="18"/>
               <w:lang w:eastAsia="ja-JP"/>
@@ -5114,8 +5075,10 @@
           </w:r>
           <w:r>
             <w:rPr>
+              <w:rFonts w:asciiTheme="minorBidi" w:hAnsiTheme="minorBidi" w:cstheme="minorBidi"/>
               <w:b/>
               <w:bCs/>
+              <w:color w:val="auto"/>
               <w:sz w:val="18"/>
               <w:szCs w:val="18"/>
               <w:lang w:eastAsia="ja-JP"/>
@@ -5124,8 +5087,10 @@
           </w:r>
           <w:r>
             <w:rPr>
+              <w:rFonts w:asciiTheme="minorBidi" w:hAnsiTheme="minorBidi" w:cstheme="minorBidi"/>
               <w:b/>
               <w:bCs/>
+              <w:color w:val="auto"/>
               <w:sz w:val="18"/>
               <w:szCs w:val="18"/>
               <w:lang w:eastAsia="ja-JP"/>
@@ -5134,6 +5099,8 @@
           </w:r>
           <w:r>
             <w:rPr>
+              <w:rFonts w:asciiTheme="minorBidi" w:hAnsiTheme="minorBidi" w:cstheme="minorBidi"/>
+              <w:color w:val="auto"/>
               <w:sz w:val="18"/>
               <w:szCs w:val="18"/>
               <w:lang w:eastAsia="ja-JP"/>
@@ -5142,6 +5109,8 @@
           </w:r>
           <w:r>
             <w:rPr>
+              <w:rFonts w:asciiTheme="minorBidi" w:hAnsiTheme="minorBidi" w:cstheme="minorBidi"/>
+              <w:color w:val="auto"/>
               <w:sz w:val="18"/>
               <w:szCs w:val="18"/>
               <w:lang w:eastAsia="ja-JP"/>
@@ -5154,7 +5123,7 @@
             <w:spacing w:after="0"/>
             <w:jc w:val="right"/>
             <w:rPr>
-              <w:rFonts w:eastAsia="Times New Roman"/>
+              <w:rFonts w:asciiTheme="minorBidi" w:eastAsia="Times New Roman" w:hAnsiTheme="minorBidi" w:cstheme="minorBidi"/>
               <w:color w:val="auto"/>
               <w:sz w:val="18"/>
               <w:szCs w:val="18"/>
@@ -5470,7 +5439,7 @@
     <w:lvl w:ilvl="0" w:tplc="4D680AEA">
       <w:start w:val="1"/>
       <w:numFmt w:val="decimal"/>
-      <w:pStyle w:val="1"/>
+      <w:pStyle w:val="Heading1"/>
       <w:lvlText w:val="%1.0"/>
       <w:lvlJc w:val="left"/>
       <w:pPr>
@@ -5998,7 +5967,7 @@
     <w:lsdException w:name="Unresolved Mention" w:semiHidden="1" w:unhideWhenUsed="1"/>
     <w:lsdException w:name="Smart Link" w:semiHidden="1" w:unhideWhenUsed="1"/>
   </w:latentStyles>
-  <w:style w:type="paragraph" w:default="1" w:styleId="a">
+  <w:style w:type="paragraph" w:default="1" w:styleId="Normal">
     <w:name w:val="Normal"/>
     <w:qFormat/>
     <w:rsid w:val="00BA00EF"/>
@@ -6010,11 +5979,11 @@
       <w:sz w:val="22"/>
     </w:rPr>
   </w:style>
-  <w:style w:type="paragraph" w:styleId="1">
+  <w:style w:type="paragraph" w:styleId="Heading1">
     <w:name w:val="heading 1"/>
-    <w:basedOn w:val="a"/>
-    <w:next w:val="a"/>
-    <w:link w:val="10"/>
+    <w:basedOn w:val="Normal"/>
+    <w:next w:val="Normal"/>
+    <w:link w:val="Heading1Char"/>
     <w:autoRedefine/>
     <w:uiPriority w:val="9"/>
     <w:qFormat/>
@@ -6039,11 +6008,11 @@
       <w:szCs w:val="28"/>
     </w:rPr>
   </w:style>
-  <w:style w:type="paragraph" w:styleId="2">
+  <w:style w:type="paragraph" w:styleId="Heading2">
     <w:name w:val="heading 2"/>
-    <w:basedOn w:val="a"/>
-    <w:next w:val="a"/>
-    <w:link w:val="20"/>
+    <w:basedOn w:val="Normal"/>
+    <w:next w:val="Normal"/>
+    <w:link w:val="Heading2Char"/>
     <w:autoRedefine/>
     <w:uiPriority w:val="9"/>
     <w:unhideWhenUsed/>
@@ -6066,11 +6035,11 @@
       <w:szCs w:val="26"/>
     </w:rPr>
   </w:style>
-  <w:style w:type="paragraph" w:styleId="3">
+  <w:style w:type="paragraph" w:styleId="Heading3">
     <w:name w:val="heading 3"/>
-    <w:basedOn w:val="a"/>
-    <w:next w:val="a"/>
-    <w:link w:val="30"/>
+    <w:basedOn w:val="Normal"/>
+    <w:next w:val="Normal"/>
+    <w:link w:val="Heading3Char"/>
     <w:uiPriority w:val="9"/>
     <w:semiHidden/>
     <w:unhideWhenUsed/>
@@ -6089,13 +6058,13 @@
       <w:szCs w:val="24"/>
     </w:rPr>
   </w:style>
-  <w:style w:type="character" w:default="1" w:styleId="a0">
+  <w:style w:type="character" w:default="1" w:styleId="DefaultParagraphFont">
     <w:name w:val="Default Paragraph Font"/>
     <w:uiPriority w:val="1"/>
     <w:semiHidden/>
     <w:unhideWhenUsed/>
   </w:style>
-  <w:style w:type="table" w:default="1" w:styleId="a1">
+  <w:style w:type="table" w:default="1" w:styleId="TableNormal">
     <w:name w:val="Normal Table"/>
     <w:uiPriority w:val="99"/>
     <w:semiHidden/>
@@ -6110,7 +6079,7 @@
       </w:tblCellMar>
     </w:tblPr>
   </w:style>
-  <w:style w:type="numbering" w:default="1" w:styleId="a2">
+  <w:style w:type="numbering" w:default="1" w:styleId="NoList">
     <w:name w:val="No List"/>
     <w:uiPriority w:val="99"/>
     <w:semiHidden/>
@@ -6118,7 +6087,7 @@
   </w:style>
   <w:style w:type="table" w:customStyle="1" w:styleId="vcvc">
     <w:name w:val="vcvc"/>
-    <w:basedOn w:val="a1"/>
+    <w:basedOn w:val="TableNormal"/>
     <w:uiPriority w:val="99"/>
     <w:qFormat/>
     <w:rsid w:val="00243C56"/>
@@ -6150,10 +6119,10 @@
       </w:tcPr>
     </w:tblStylePr>
   </w:style>
-  <w:style w:type="paragraph" w:styleId="a3">
+  <w:style w:type="paragraph" w:styleId="Header">
     <w:name w:val="header"/>
-    <w:basedOn w:val="a"/>
-    <w:link w:val="a4"/>
+    <w:basedOn w:val="Normal"/>
+    <w:link w:val="HeaderChar"/>
     <w:uiPriority w:val="99"/>
     <w:unhideWhenUsed/>
     <w:rsid w:val="00087302"/>
@@ -6165,20 +6134,20 @@
       <w:spacing w:after="0"/>
     </w:pPr>
   </w:style>
-  <w:style w:type="character" w:customStyle="1" w:styleId="a4">
-    <w:name w:val="כותרת עליונה תו"/>
-    <w:basedOn w:val="a0"/>
-    <w:link w:val="a3"/>
+  <w:style w:type="character" w:customStyle="1" w:styleId="HeaderChar">
+    <w:name w:val="Header Char"/>
+    <w:basedOn w:val="DefaultParagraphFont"/>
+    <w:link w:val="Header"/>
     <w:uiPriority w:val="99"/>
     <w:rsid w:val="00087302"/>
     <w:rPr>
       <w:sz w:val="22"/>
     </w:rPr>
   </w:style>
-  <w:style w:type="paragraph" w:styleId="a5">
+  <w:style w:type="paragraph" w:styleId="Footer">
     <w:name w:val="footer"/>
-    <w:basedOn w:val="a"/>
-    <w:link w:val="a6"/>
+    <w:basedOn w:val="Normal"/>
+    <w:link w:val="FooterChar"/>
     <w:uiPriority w:val="99"/>
     <w:unhideWhenUsed/>
     <w:rsid w:val="00087302"/>
@@ -6190,19 +6159,19 @@
       <w:spacing w:after="0"/>
     </w:pPr>
   </w:style>
-  <w:style w:type="character" w:customStyle="1" w:styleId="a6">
-    <w:name w:val="כותרת תחתונה תו"/>
-    <w:basedOn w:val="a0"/>
-    <w:link w:val="a5"/>
+  <w:style w:type="character" w:customStyle="1" w:styleId="FooterChar">
+    <w:name w:val="Footer Char"/>
+    <w:basedOn w:val="DefaultParagraphFont"/>
+    <w:link w:val="Footer"/>
     <w:uiPriority w:val="99"/>
     <w:rsid w:val="00087302"/>
     <w:rPr>
       <w:sz w:val="22"/>
     </w:rPr>
   </w:style>
-  <w:style w:type="table" w:styleId="a7">
+  <w:style w:type="table" w:styleId="TableGrid">
     <w:name w:val="Table Grid"/>
-    <w:basedOn w:val="a1"/>
+    <w:basedOn w:val="TableNormal"/>
     <w:uiPriority w:val="39"/>
     <w:rsid w:val="00582B44"/>
     <w:tblPr>
@@ -6216,9 +6185,9 @@
       </w:tblBorders>
     </w:tblPr>
   </w:style>
-  <w:style w:type="character" w:styleId="a8">
+  <w:style w:type="character" w:styleId="CommentReference">
     <w:name w:val="annotation reference"/>
-    <w:basedOn w:val="a0"/>
+    <w:basedOn w:val="DefaultParagraphFont"/>
     <w:uiPriority w:val="99"/>
     <w:semiHidden/>
     <w:unhideWhenUsed/>
@@ -6228,18 +6197,18 @@
       <w:szCs w:val="16"/>
     </w:rPr>
   </w:style>
-  <w:style w:type="paragraph" w:styleId="a9">
+  <w:style w:type="paragraph" w:styleId="CommentText">
     <w:name w:val="annotation text"/>
-    <w:basedOn w:val="a"/>
-    <w:link w:val="aa"/>
+    <w:basedOn w:val="Normal"/>
+    <w:link w:val="CommentTextChar"/>
     <w:uiPriority w:val="99"/>
     <w:unhideWhenUsed/>
     <w:rsid w:val="008D720F"/>
   </w:style>
-  <w:style w:type="character" w:customStyle="1" w:styleId="aa">
-    <w:name w:val="טקסט הערה תו"/>
-    <w:basedOn w:val="a0"/>
-    <w:link w:val="a9"/>
+  <w:style w:type="character" w:customStyle="1" w:styleId="CommentTextChar">
+    <w:name w:val="Comment Text Char"/>
+    <w:basedOn w:val="DefaultParagraphFont"/>
+    <w:link w:val="CommentText"/>
     <w:uiPriority w:val="99"/>
     <w:rsid w:val="008D720F"/>
     <w:rPr>
@@ -6247,11 +6216,11 @@
       <w:sz w:val="22"/>
     </w:rPr>
   </w:style>
-  <w:style w:type="paragraph" w:styleId="ab">
+  <w:style w:type="paragraph" w:styleId="CommentSubject">
     <w:name w:val="annotation subject"/>
-    <w:basedOn w:val="a9"/>
-    <w:next w:val="a9"/>
-    <w:link w:val="ac"/>
+    <w:basedOn w:val="CommentText"/>
+    <w:next w:val="CommentText"/>
+    <w:link w:val="CommentSubjectChar"/>
     <w:uiPriority w:val="99"/>
     <w:semiHidden/>
     <w:unhideWhenUsed/>
@@ -6261,10 +6230,10 @@
       <w:bCs/>
     </w:rPr>
   </w:style>
-  <w:style w:type="character" w:customStyle="1" w:styleId="ac">
-    <w:name w:val="נושא הערה תו"/>
-    <w:basedOn w:val="aa"/>
-    <w:link w:val="ab"/>
+  <w:style w:type="character" w:customStyle="1" w:styleId="CommentSubjectChar">
+    <w:name w:val="Comment Subject Char"/>
+    <w:basedOn w:val="CommentTextChar"/>
+    <w:link w:val="CommentSubject"/>
     <w:uiPriority w:val="99"/>
     <w:semiHidden/>
     <w:rsid w:val="008D720F"/>
@@ -6275,10 +6244,10 @@
       <w:sz w:val="22"/>
     </w:rPr>
   </w:style>
-  <w:style w:type="paragraph" w:styleId="ad">
+  <w:style w:type="paragraph" w:styleId="BalloonText">
     <w:name w:val="Balloon Text"/>
-    <w:basedOn w:val="a"/>
-    <w:link w:val="ae"/>
+    <w:basedOn w:val="Normal"/>
+    <w:link w:val="BalloonTextChar"/>
     <w:uiPriority w:val="99"/>
     <w:semiHidden/>
     <w:unhideWhenUsed/>
@@ -6292,10 +6261,10 @@
       <w:szCs w:val="16"/>
     </w:rPr>
   </w:style>
-  <w:style w:type="character" w:customStyle="1" w:styleId="ae">
-    <w:name w:val="טקסט בלונים תו"/>
-    <w:basedOn w:val="a0"/>
-    <w:link w:val="ad"/>
+  <w:style w:type="character" w:customStyle="1" w:styleId="BalloonTextChar">
+    <w:name w:val="Balloon Text Char"/>
+    <w:basedOn w:val="DefaultParagraphFont"/>
+    <w:link w:val="BalloonText"/>
     <w:uiPriority w:val="99"/>
     <w:semiHidden/>
     <w:rsid w:val="008D720F"/>
@@ -6306,7 +6275,7 @@
       <w:szCs w:val="16"/>
     </w:rPr>
   </w:style>
-  <w:style w:type="paragraph" w:styleId="af">
+  <w:style w:type="paragraph" w:styleId="Revision">
     <w:name w:val="Revision"/>
     <w:hidden/>
     <w:uiPriority w:val="99"/>
@@ -6319,7 +6288,7 @@
   </w:style>
   <w:style w:type="paragraph" w:styleId="NormalWeb">
     <w:name w:val="Normal (Web)"/>
-    <w:basedOn w:val="a"/>
+    <w:basedOn w:val="Normal"/>
     <w:uiPriority w:val="99"/>
     <w:semiHidden/>
     <w:unhideWhenUsed/>
@@ -6431,7 +6400,7 @@
   </w:style>
   <w:style w:type="paragraph" w:customStyle="1" w:styleId="paragraph">
     <w:name w:val="paragraph"/>
-    <w:basedOn w:val="a"/>
+    <w:basedOn w:val="Normal"/>
     <w:rsid w:val="00A25923"/>
     <w:pPr>
       <w:spacing w:before="100" w:beforeAutospacing="1" w:after="100" w:afterAutospacing="1"/>
@@ -6445,18 +6414,18 @@
   </w:style>
   <w:style w:type="character" w:customStyle="1" w:styleId="normaltextrun">
     <w:name w:val="normaltextrun"/>
-    <w:basedOn w:val="a0"/>
+    <w:basedOn w:val="DefaultParagraphFont"/>
     <w:rsid w:val="00A25923"/>
   </w:style>
   <w:style w:type="character" w:customStyle="1" w:styleId="eop">
     <w:name w:val="eop"/>
-    <w:basedOn w:val="a0"/>
+    <w:basedOn w:val="DefaultParagraphFont"/>
     <w:rsid w:val="00A25923"/>
   </w:style>
-  <w:style w:type="character" w:customStyle="1" w:styleId="10">
-    <w:name w:val="כותרת 1 תו"/>
-    <w:basedOn w:val="a0"/>
-    <w:link w:val="1"/>
+  <w:style w:type="character" w:customStyle="1" w:styleId="Heading1Char">
+    <w:name w:val="Heading 1 Char"/>
+    <w:basedOn w:val="DefaultParagraphFont"/>
+    <w:link w:val="Heading1"/>
     <w:uiPriority w:val="9"/>
     <w:rsid w:val="00F00009"/>
     <w:rPr>
@@ -6466,10 +6435,10 @@
       <w:szCs w:val="28"/>
     </w:rPr>
   </w:style>
-  <w:style w:type="character" w:customStyle="1" w:styleId="20">
-    <w:name w:val="כותרת 2 תו"/>
-    <w:basedOn w:val="a0"/>
-    <w:link w:val="2"/>
+  <w:style w:type="character" w:customStyle="1" w:styleId="Heading2Char">
+    <w:name w:val="Heading 2 Char"/>
+    <w:basedOn w:val="DefaultParagraphFont"/>
+    <w:link w:val="Heading2"/>
     <w:uiPriority w:val="9"/>
     <w:rsid w:val="00764833"/>
     <w:rPr>
@@ -6479,10 +6448,10 @@
       <w:szCs w:val="26"/>
     </w:rPr>
   </w:style>
-  <w:style w:type="character" w:customStyle="1" w:styleId="30">
-    <w:name w:val="כותרת 3 תו"/>
-    <w:basedOn w:val="a0"/>
-    <w:link w:val="3"/>
+  <w:style w:type="character" w:customStyle="1" w:styleId="Heading3Char">
+    <w:name w:val="Heading 3 Char"/>
+    <w:basedOn w:val="DefaultParagraphFont"/>
+    <w:link w:val="Heading3"/>
     <w:uiPriority w:val="9"/>
     <w:semiHidden/>
     <w:rsid w:val="00D8430E"/>
@@ -6495,7 +6464,7 @@
   </w:style>
   <w:style w:type="character" w:customStyle="1" w:styleId="cf01">
     <w:name w:val="cf01"/>
-    <w:basedOn w:val="a0"/>
+    <w:basedOn w:val="DefaultParagraphFont"/>
     <w:rsid w:val="00F76D96"/>
     <w:rPr>
       <w:rFonts w:ascii="Segoe UI" w:hAnsi="Segoe UI" w:cs="Segoe UI" w:hint="default"/>
@@ -6505,7 +6474,7 @@
   </w:style>
   <w:style w:type="character" w:customStyle="1" w:styleId="cf11">
     <w:name w:val="cf11"/>
-    <w:basedOn w:val="a0"/>
+    <w:basedOn w:val="DefaultParagraphFont"/>
     <w:rsid w:val="00EF426C"/>
     <w:rPr>
       <w:rFonts w:ascii="Segoe UI" w:hAnsi="Segoe UI" w:cs="Segoe UI" w:hint="default"/>
@@ -6515,10 +6484,10 @@
       <w:szCs w:val="30"/>
     </w:rPr>
   </w:style>
-  <w:style w:type="paragraph" w:styleId="HTML">
+  <w:style w:type="paragraph" w:styleId="HTMLPreformatted">
     <w:name w:val="HTML Preformatted"/>
-    <w:basedOn w:val="a"/>
-    <w:link w:val="HTML0"/>
+    <w:basedOn w:val="Normal"/>
+    <w:link w:val="HTMLPreformattedChar"/>
     <w:uiPriority w:val="99"/>
     <w:semiHidden/>
     <w:unhideWhenUsed/>
@@ -6531,10 +6500,10 @@
       <w:sz w:val="20"/>
     </w:rPr>
   </w:style>
-  <w:style w:type="character" w:customStyle="1" w:styleId="HTML0">
-    <w:name w:val="HTML מעוצב מראש תו"/>
-    <w:basedOn w:val="a0"/>
-    <w:link w:val="HTML"/>
+  <w:style w:type="character" w:customStyle="1" w:styleId="HTMLPreformattedChar">
+    <w:name w:val="HTML Preformatted Char"/>
+    <w:basedOn w:val="DefaultParagraphFont"/>
+    <w:link w:val="HTMLPreformatted"/>
     <w:uiPriority w:val="99"/>
     <w:semiHidden/>
     <w:rsid w:val="003F4D71"/>
@@ -6832,12 +6801,7 @@
 </file>
 
 <file path=customXml/item1.xml><?xml version="1.0" encoding="utf-8"?>
-<?mso-contentType ?>
-<FormTemplates xmlns="http://schemas.microsoft.com/sharepoint/v3/contenttype/forms">
-  <Display>DocumentLibraryForm</Display>
-  <Edit>DocumentLibraryForm</Edit>
-  <New>DocumentLibraryForm</New>
-</FormTemplates>
+<b:Sources xmlns:b="http://schemas.openxmlformats.org/officeDocument/2006/bibliography" xmlns="http://schemas.openxmlformats.org/officeDocument/2006/bibliography" SelectedStyle="\APASixthEditionOfficeOnline.xsl" StyleName="APA" Version="6"/>
 </file>
 
 <file path=customXml/item2.xml><?xml version="1.0" encoding="utf-8"?>
@@ -6985,7 +6949,12 @@
 </file>
 
 <file path=customXml/item3.xml><?xml version="1.0" encoding="utf-8"?>
-<b:Sources xmlns:b="http://schemas.openxmlformats.org/officeDocument/2006/bibliography" xmlns="http://schemas.openxmlformats.org/officeDocument/2006/bibliography" SelectedStyle="\APASixthEditionOfficeOnline.xsl" StyleName="APA" Version="6"/>
+<?mso-contentType ?>
+<FormTemplates xmlns="http://schemas.microsoft.com/sharepoint/v3/contenttype/forms">
+  <Display>DocumentLibraryForm</Display>
+  <Edit>DocumentLibraryForm</Edit>
+  <New>DocumentLibraryForm</New>
+</FormTemplates>
 </file>
 
 <file path=customXml/item4.xml><?xml version="1.0" encoding="utf-8"?>
@@ -6995,9 +6964,9 @@
 </file>
 
 <file path=customXml/itemProps1.xml><?xml version="1.0" encoding="utf-8"?>
-<ds:datastoreItem xmlns:ds="http://schemas.openxmlformats.org/officeDocument/2006/customXml" ds:itemID="{E6B069D2-3F25-4D75-8C56-FA3DA451B105}">
+<ds:datastoreItem xmlns:ds="http://schemas.openxmlformats.org/officeDocument/2006/customXml" ds:itemID="{51C305F4-FC42-44BF-937D-622594B759D6}">
   <ds:schemaRefs>
-    <ds:schemaRef ds:uri="http://schemas.microsoft.com/sharepoint/v3/contenttype/forms"/>
+    <ds:schemaRef ds:uri="http://schemas.openxmlformats.org/officeDocument/2006/bibliography"/>
   </ds:schemaRefs>
 </ds:datastoreItem>
 </file>
@@ -7021,9 +6990,9 @@
 </file>
 
 <file path=customXml/itemProps3.xml><?xml version="1.0" encoding="utf-8"?>
-<ds:datastoreItem xmlns:ds="http://schemas.openxmlformats.org/officeDocument/2006/customXml" ds:itemID="{51C305F4-FC42-44BF-937D-622594B759D6}">
+<ds:datastoreItem xmlns:ds="http://schemas.openxmlformats.org/officeDocument/2006/customXml" ds:itemID="{E6B069D2-3F25-4D75-8C56-FA3DA451B105}">
   <ds:schemaRefs>
-    <ds:schemaRef ds:uri="http://schemas.openxmlformats.org/officeDocument/2006/bibliography"/>
+    <ds:schemaRef ds:uri="http://schemas.microsoft.com/sharepoint/v3/contenttype/forms"/>
   </ds:schemaRefs>
 </ds:datastoreItem>
 </file>

</xml_diff>

<commit_message>
Enhance STD Normalizer cycle defaults and package updated template
Expanded cycle presets to support protocol number, report number, test plan, STX number, and prepared by values; improved nested configuration merging while preserving existing user values; updated related tests and comments; and packaged the corrected audit-grade STD Normalizer template.
</commit_message>
<xml_diff>
--- a/Scripts/Template.docx
+++ b/Scripts/Template.docx
@@ -1467,7 +1467,14 @@
         <w:rPr>
           <w:color w:val="000000" w:themeColor="text1"/>
         </w:rPr>
-        <w:t>ADD_PROTOCOL_NUMBER#</w:t>
+        <w:t>ADD_PROTOCOL_</w:t>
+      </w:r>
+      <w:proofErr w:type="gramStart"/>
+      <w:r>
+        <w:rPr>
+          <w:color w:val="000000" w:themeColor="text1"/>
+        </w:rPr>
+        <w:t>NUMBER#</w:t>
       </w:r>
       <w:r>
         <w:rPr>
@@ -1475,6 +1482,7 @@
         </w:rPr>
         <w:t>)</w:t>
       </w:r>
+      <w:proofErr w:type="gramEnd"/>
       <w:r>
         <w:t>.</w:t>
       </w:r>
@@ -4435,7 +4443,10 @@
     <w:sectPr>
       <w:headerReference w:type="even" r:id="rId11"/>
       <w:headerReference w:type="default" r:id="rId12"/>
-      <w:footerReference w:type="default" r:id="rId13"/>
+      <w:footerReference w:type="even" r:id="rId13"/>
+      <w:footerReference w:type="default" r:id="rId14"/>
+      <w:headerReference w:type="first" r:id="rId15"/>
+      <w:footerReference w:type="first" r:id="rId16"/>
       <w:pgSz w:w="23818" w:h="16834" w:orient="landscape" w:code="8"/>
       <w:pgMar w:top="1440" w:right="720" w:bottom="1008" w:left="720" w:header="720" w:footer="300" w:gutter="0"/>
       <w:cols w:space="720"/>
@@ -4480,6 +4491,16 @@
 </file>
 
 <file path=word/footer1.xml><?xml version="1.0" encoding="utf-8"?>
+<w:ftr xmlns:wpc="http://schemas.microsoft.com/office/word/2010/wordprocessingCanvas" xmlns:cx="http://schemas.microsoft.com/office/drawing/2014/chartex" xmlns:cx1="http://schemas.microsoft.com/office/drawing/2015/9/8/chartex" xmlns:cx2="http://schemas.microsoft.com/office/drawing/2015/10/21/chartex" xmlns:cx3="http://schemas.microsoft.com/office/drawing/2016/5/9/chartex" xmlns:cx4="http://schemas.microsoft.com/office/drawing/2016/5/10/chartex" xmlns:cx5="http://schemas.microsoft.com/office/drawing/2016/5/11/chartex" xmlns:cx6="http://schemas.microsoft.com/office/drawing/2016/5/12/chartex" xmlns:cx7="http://schemas.microsoft.com/office/drawing/2016/5/13/chartex" xmlns:cx8="http://schemas.microsoft.com/office/drawing/2016/5/14/chartex" xmlns:mc="http://schemas.openxmlformats.org/markup-compatibility/2006" xmlns:aink="http://schemas.microsoft.com/office/drawing/2016/ink" xmlns:am3d="http://schemas.microsoft.com/office/drawing/2017/model3d" xmlns:o="urn:schemas-microsoft-com:office:office" xmlns:oel="http://schemas.microsoft.com/office/2019/extlst" xmlns:r="http://schemas.openxmlformats.org/officeDocument/2006/relationships" xmlns:m="http://schemas.openxmlformats.org/officeDocument/2006/math" xmlns:v="urn:schemas-microsoft-com:vml" xmlns:wp14="http://schemas.microsoft.com/office/word/2010/wordprocessingDrawing" xmlns:wp="http://schemas.openxmlformats.org/drawingml/2006/wordprocessingDrawing" xmlns:w10="urn:schemas-microsoft-com:office:word" xmlns:w="http://schemas.openxmlformats.org/wordprocessingml/2006/main" xmlns:w14="http://schemas.microsoft.com/office/word/2010/wordml" xmlns:w15="http://schemas.microsoft.com/office/word/2012/wordml" xmlns:w16cex="http://schemas.microsoft.com/office/word/2018/wordml/cex" xmlns:w16cid="http://schemas.microsoft.com/office/word/2016/wordml/cid" xmlns:w16="http://schemas.microsoft.com/office/word/2018/wordml" xmlns:w16du="http://schemas.microsoft.com/office/word/2023/wordml/word16du" xmlns:w16sdtdh="http://schemas.microsoft.com/office/word/2020/wordml/sdtdatahash" xmlns:w16sdtfl="http://schemas.microsoft.com/office/word/2024/wordml/sdtformatlock" xmlns:w16se="http://schemas.microsoft.com/office/word/2015/wordml/symex" xmlns:wpg="http://schemas.microsoft.com/office/word/2010/wordprocessingGroup" xmlns:wpi="http://schemas.microsoft.com/office/word/2010/wordprocessingInk" xmlns:wne="http://schemas.microsoft.com/office/word/2006/wordml" xmlns:wps="http://schemas.microsoft.com/office/word/2010/wordprocessingShape" mc:Ignorable="w14 w15 w16se w16cid w16 w16cex w16sdtdh w16sdtfl w16du wp14">
+  <w:p>
+    <w:pPr>
+      <w:pStyle w:val="Footer"/>
+    </w:pPr>
+  </w:p>
+</w:ftr>
+</file>
+
+<file path=word/footer2.xml><?xml version="1.0" encoding="utf-8"?>
 <w:ftr xmlns:wpc="http://schemas.microsoft.com/office/word/2010/wordprocessingCanvas" xmlns:cx="http://schemas.microsoft.com/office/drawing/2014/chartex" xmlns:cx1="http://schemas.microsoft.com/office/drawing/2015/9/8/chartex" xmlns:cx2="http://schemas.microsoft.com/office/drawing/2015/10/21/chartex" xmlns:cx3="http://schemas.microsoft.com/office/drawing/2016/5/9/chartex" xmlns:cx4="http://schemas.microsoft.com/office/drawing/2016/5/10/chartex" xmlns:cx5="http://schemas.microsoft.com/office/drawing/2016/5/11/chartex" xmlns:cx6="http://schemas.microsoft.com/office/drawing/2016/5/12/chartex" xmlns:cx7="http://schemas.microsoft.com/office/drawing/2016/5/13/chartex" xmlns:cx8="http://schemas.microsoft.com/office/drawing/2016/5/14/chartex" xmlns:mc="http://schemas.openxmlformats.org/markup-compatibility/2006" xmlns:aink="http://schemas.microsoft.com/office/drawing/2016/ink" xmlns:am3d="http://schemas.microsoft.com/office/drawing/2017/model3d" xmlns:o="urn:schemas-microsoft-com:office:office" xmlns:oel="http://schemas.microsoft.com/office/2019/extlst" xmlns:r="http://schemas.openxmlformats.org/officeDocument/2006/relationships" xmlns:m="http://schemas.openxmlformats.org/officeDocument/2006/math" xmlns:v="urn:schemas-microsoft-com:vml" xmlns:wp14="http://schemas.microsoft.com/office/word/2010/wordprocessingDrawing" xmlns:wp="http://schemas.openxmlformats.org/drawingml/2006/wordprocessingDrawing" xmlns:w10="urn:schemas-microsoft-com:office:word" xmlns:w="http://schemas.openxmlformats.org/wordprocessingml/2006/main" xmlns:w14="http://schemas.microsoft.com/office/word/2010/wordml" xmlns:w15="http://schemas.microsoft.com/office/word/2012/wordml" xmlns:w16cex="http://schemas.microsoft.com/office/word/2018/wordml/cex" xmlns:w16cid="http://schemas.microsoft.com/office/word/2016/wordml/cid" xmlns:w16="http://schemas.microsoft.com/office/word/2018/wordml" xmlns:w16du="http://schemas.microsoft.com/office/word/2023/wordml/word16du" xmlns:w16sdtdh="http://schemas.microsoft.com/office/word/2020/wordml/sdtdatahash" xmlns:w16sdtfl="http://schemas.microsoft.com/office/word/2024/wordml/sdtformatlock" xmlns:w16se="http://schemas.microsoft.com/office/word/2015/wordml/symex" xmlns:wpg="http://schemas.microsoft.com/office/word/2010/wordprocessingGroup" xmlns:wpi="http://schemas.microsoft.com/office/word/2010/wordprocessingInk" xmlns:wne="http://schemas.microsoft.com/office/word/2006/wordml" xmlns:wps="http://schemas.microsoft.com/office/word/2010/wordprocessingShape" mc:Ignorable="w14 w15 w16se w16cid w16 w16cex w16sdtdh w16sdtfl w16du wp14">
   <w:tbl>
     <w:tblPr>
@@ -4683,6 +4704,16 @@
       </w:rPr>
       <w:t>Verify revision is current prior to use.</w:t>
     </w:r>
+  </w:p>
+</w:ftr>
+</file>
+
+<file path=word/footer3.xml><?xml version="1.0" encoding="utf-8"?>
+<w:ftr xmlns:wpc="http://schemas.microsoft.com/office/word/2010/wordprocessingCanvas" xmlns:cx="http://schemas.microsoft.com/office/drawing/2014/chartex" xmlns:cx1="http://schemas.microsoft.com/office/drawing/2015/9/8/chartex" xmlns:cx2="http://schemas.microsoft.com/office/drawing/2015/10/21/chartex" xmlns:cx3="http://schemas.microsoft.com/office/drawing/2016/5/9/chartex" xmlns:cx4="http://schemas.microsoft.com/office/drawing/2016/5/10/chartex" xmlns:cx5="http://schemas.microsoft.com/office/drawing/2016/5/11/chartex" xmlns:cx6="http://schemas.microsoft.com/office/drawing/2016/5/12/chartex" xmlns:cx7="http://schemas.microsoft.com/office/drawing/2016/5/13/chartex" xmlns:cx8="http://schemas.microsoft.com/office/drawing/2016/5/14/chartex" xmlns:mc="http://schemas.openxmlformats.org/markup-compatibility/2006" xmlns:aink="http://schemas.microsoft.com/office/drawing/2016/ink" xmlns:am3d="http://schemas.microsoft.com/office/drawing/2017/model3d" xmlns:o="urn:schemas-microsoft-com:office:office" xmlns:oel="http://schemas.microsoft.com/office/2019/extlst" xmlns:r="http://schemas.openxmlformats.org/officeDocument/2006/relationships" xmlns:m="http://schemas.openxmlformats.org/officeDocument/2006/math" xmlns:v="urn:schemas-microsoft-com:vml" xmlns:wp14="http://schemas.microsoft.com/office/word/2010/wordprocessingDrawing" xmlns:wp="http://schemas.openxmlformats.org/drawingml/2006/wordprocessingDrawing" xmlns:w10="urn:schemas-microsoft-com:office:word" xmlns:w="http://schemas.openxmlformats.org/wordprocessingml/2006/main" xmlns:w14="http://schemas.microsoft.com/office/word/2010/wordml" xmlns:w15="http://schemas.microsoft.com/office/word/2012/wordml" xmlns:w16cex="http://schemas.microsoft.com/office/word/2018/wordml/cex" xmlns:w16cid="http://schemas.microsoft.com/office/word/2016/wordml/cid" xmlns:w16="http://schemas.microsoft.com/office/word/2018/wordml" xmlns:w16du="http://schemas.microsoft.com/office/word/2023/wordml/word16du" xmlns:w16sdtdh="http://schemas.microsoft.com/office/word/2020/wordml/sdtdatahash" xmlns:w16sdtfl="http://schemas.microsoft.com/office/word/2024/wordml/sdtformatlock" xmlns:w16se="http://schemas.microsoft.com/office/word/2015/wordml/symex" xmlns:wpg="http://schemas.microsoft.com/office/word/2010/wordprocessingGroup" xmlns:wpi="http://schemas.microsoft.com/office/word/2010/wordprocessingInk" xmlns:wne="http://schemas.microsoft.com/office/word/2006/wordml" xmlns:wps="http://schemas.microsoft.com/office/word/2010/wordprocessingShape" mc:Ignorable="w14 w15 w16se w16cid w16 w16cex w16sdtdh w16sdtfl w16du wp14">
+  <w:p>
+    <w:pPr>
+      <w:pStyle w:val="Footer"/>
+    </w:pPr>
   </w:p>
 </w:ftr>
 </file>
@@ -5136,6 +5167,16 @@
   <w:p>
     <w:pPr>
       <w:spacing w:after="0"/>
+    </w:pPr>
+  </w:p>
+</w:hdr>
+</file>
+
+<file path=word/header3.xml><?xml version="1.0" encoding="utf-8"?>
+<w:hdr xmlns:wpc="http://schemas.microsoft.com/office/word/2010/wordprocessingCanvas" xmlns:cx="http://schemas.microsoft.com/office/drawing/2014/chartex" xmlns:cx1="http://schemas.microsoft.com/office/drawing/2015/9/8/chartex" xmlns:cx2="http://schemas.microsoft.com/office/drawing/2015/10/21/chartex" xmlns:cx3="http://schemas.microsoft.com/office/drawing/2016/5/9/chartex" xmlns:cx4="http://schemas.microsoft.com/office/drawing/2016/5/10/chartex" xmlns:cx5="http://schemas.microsoft.com/office/drawing/2016/5/11/chartex" xmlns:cx6="http://schemas.microsoft.com/office/drawing/2016/5/12/chartex" xmlns:cx7="http://schemas.microsoft.com/office/drawing/2016/5/13/chartex" xmlns:cx8="http://schemas.microsoft.com/office/drawing/2016/5/14/chartex" xmlns:mc="http://schemas.openxmlformats.org/markup-compatibility/2006" xmlns:aink="http://schemas.microsoft.com/office/drawing/2016/ink" xmlns:am3d="http://schemas.microsoft.com/office/drawing/2017/model3d" xmlns:o="urn:schemas-microsoft-com:office:office" xmlns:oel="http://schemas.microsoft.com/office/2019/extlst" xmlns:r="http://schemas.openxmlformats.org/officeDocument/2006/relationships" xmlns:m="http://schemas.openxmlformats.org/officeDocument/2006/math" xmlns:v="urn:schemas-microsoft-com:vml" xmlns:wp14="http://schemas.microsoft.com/office/word/2010/wordprocessingDrawing" xmlns:wp="http://schemas.openxmlformats.org/drawingml/2006/wordprocessingDrawing" xmlns:w10="urn:schemas-microsoft-com:office:word" xmlns:w="http://schemas.openxmlformats.org/wordprocessingml/2006/main" xmlns:w14="http://schemas.microsoft.com/office/word/2010/wordml" xmlns:w15="http://schemas.microsoft.com/office/word/2012/wordml" xmlns:w16cex="http://schemas.microsoft.com/office/word/2018/wordml/cex" xmlns:w16cid="http://schemas.microsoft.com/office/word/2016/wordml/cid" xmlns:w16="http://schemas.microsoft.com/office/word/2018/wordml" xmlns:w16du="http://schemas.microsoft.com/office/word/2023/wordml/word16du" xmlns:w16sdtdh="http://schemas.microsoft.com/office/word/2020/wordml/sdtdatahash" xmlns:w16sdtfl="http://schemas.microsoft.com/office/word/2024/wordml/sdtformatlock" xmlns:w16se="http://schemas.microsoft.com/office/word/2015/wordml/symex" xmlns:wpg="http://schemas.microsoft.com/office/word/2010/wordprocessingGroup" xmlns:wpi="http://schemas.microsoft.com/office/word/2010/wordprocessingInk" xmlns:wne="http://schemas.microsoft.com/office/word/2006/wordml" xmlns:wps="http://schemas.microsoft.com/office/word/2010/wordprocessingShape" mc:Ignorable="w14 w15 w16se w16cid w16 w16cex w16sdtdh w16sdtfl w16du wp14">
+  <w:p>
+    <w:pPr>
+      <w:pStyle w:val="Header"/>
     </w:pPr>
   </w:p>
 </w:hdr>
@@ -6801,7 +6842,12 @@
 </file>
 
 <file path=customXml/item1.xml><?xml version="1.0" encoding="utf-8"?>
-<b:Sources xmlns:b="http://schemas.openxmlformats.org/officeDocument/2006/bibliography" xmlns="http://schemas.openxmlformats.org/officeDocument/2006/bibliography" SelectedStyle="\APASixthEditionOfficeOnline.xsl" StyleName="APA" Version="6"/>
+<?mso-contentType ?>
+<FormTemplates xmlns="http://schemas.microsoft.com/sharepoint/v3/contenttype/forms">
+  <Display>DocumentLibraryForm</Display>
+  <Edit>DocumentLibraryForm</Edit>
+  <New>DocumentLibraryForm</New>
+</FormTemplates>
 </file>
 
 <file path=customXml/item2.xml><?xml version="1.0" encoding="utf-8"?>
@@ -6949,12 +6995,7 @@
 </file>
 
 <file path=customXml/item3.xml><?xml version="1.0" encoding="utf-8"?>
-<?mso-contentType ?>
-<FormTemplates xmlns="http://schemas.microsoft.com/sharepoint/v3/contenttype/forms">
-  <Display>DocumentLibraryForm</Display>
-  <Edit>DocumentLibraryForm</Edit>
-  <New>DocumentLibraryForm</New>
-</FormTemplates>
+<b:Sources xmlns:b="http://schemas.openxmlformats.org/officeDocument/2006/bibliography" xmlns="http://schemas.openxmlformats.org/officeDocument/2006/bibliography" SelectedStyle="\APASixthEditionOfficeOnline.xsl" StyleName="APA" Version="6"/>
 </file>
 
 <file path=customXml/item4.xml><?xml version="1.0" encoding="utf-8"?>
@@ -6964,9 +7005,9 @@
 </file>
 
 <file path=customXml/itemProps1.xml><?xml version="1.0" encoding="utf-8"?>
-<ds:datastoreItem xmlns:ds="http://schemas.openxmlformats.org/officeDocument/2006/customXml" ds:itemID="{51C305F4-FC42-44BF-937D-622594B759D6}">
+<ds:datastoreItem xmlns:ds="http://schemas.openxmlformats.org/officeDocument/2006/customXml" ds:itemID="{E6B069D2-3F25-4D75-8C56-FA3DA451B105}">
   <ds:schemaRefs>
-    <ds:schemaRef ds:uri="http://schemas.openxmlformats.org/officeDocument/2006/bibliography"/>
+    <ds:schemaRef ds:uri="http://schemas.microsoft.com/sharepoint/v3/contenttype/forms"/>
   </ds:schemaRefs>
 </ds:datastoreItem>
 </file>
@@ -6990,9 +7031,9 @@
 </file>
 
 <file path=customXml/itemProps3.xml><?xml version="1.0" encoding="utf-8"?>
-<ds:datastoreItem xmlns:ds="http://schemas.openxmlformats.org/officeDocument/2006/customXml" ds:itemID="{E6B069D2-3F25-4D75-8C56-FA3DA451B105}">
+<ds:datastoreItem xmlns:ds="http://schemas.openxmlformats.org/officeDocument/2006/customXml" ds:itemID="{51C305F4-FC42-44BF-937D-622594B759D6}">
   <ds:schemaRefs>
-    <ds:schemaRef ds:uri="http://schemas.microsoft.com/sharepoint/v3/contenttype/forms"/>
+    <ds:schemaRef ds:uri="http://schemas.openxmlformats.org/officeDocument/2006/bibliography"/>
   </ds:schemaRefs>
 </ds:datastoreItem>
 </file>

</xml_diff>

<commit_message>
Add FMR cycle 2.7.5; sync template.docx on change; cycles now fully mirror default (add/update/delete)
</commit_message>
<xml_diff>
--- a/Scripts/Template.docx
+++ b/Scripts/Template.docx
@@ -283,7 +283,7 @@
           <w:bCs/>
           <w:color w:val="000000" w:themeColor="text1"/>
         </w:rPr>
-        <w:t>ADD_PROTOCOL_NUMBER#</w:t>
+        <w:t>ADD_</w:t>
       </w:r>
       <w:r>
         <w:rPr>
@@ -291,7 +291,7 @@
           <w:bCs/>
           <w:color w:val="000000" w:themeColor="text1"/>
         </w:rPr>
-        <w:t xml:space="preserve"> ADD_</w:t>
+        <w:t>PROTOCOL_NUMBER#</w:t>
       </w:r>
       <w:r>
         <w:rPr>
@@ -299,7 +299,18 @@
           <w:bCs/>
           <w:color w:val="000000" w:themeColor="text1"/>
         </w:rPr>
-        <w:t>DOC_STX</w:t>
+        <w:t xml:space="preserve"> </w:t>
+      </w:r>
+      <w:r>
+        <w:rPr>
+          <w:rFonts w:asciiTheme="minorBidi" w:hAnsiTheme="minorBidi" w:cstheme="minorBidi"/>
+          <w:b/>
+          <w:bCs/>
+          <w:color w:val="auto"/>
+          <w:szCs w:val="22"/>
+          <w:shd w:val="clear" w:color="auto" w:fill="FFFFFF"/>
+        </w:rPr>
+        <w:t>ADD_STX_NUMBER</w:t>
       </w:r>
     </w:p>
     <w:p>
@@ -392,28 +403,10 @@
     <w:p/>
     <w:p/>
     <w:p/>
-    <w:p/>
-    <w:p/>
     <w:p>
       <w:pPr>
         <w:tabs>
-          <w:tab w:val="left" w:pos="13839"/>
-        </w:tabs>
-        <w:spacing w:after="0"/>
-      </w:pPr>
-    </w:p>
-    <w:p>
-      <w:pPr>
-        <w:tabs>
-          <w:tab w:val="left" w:pos="13839"/>
-        </w:tabs>
-        <w:spacing w:after="0"/>
-      </w:pPr>
-    </w:p>
-    <w:p>
-      <w:pPr>
-        <w:tabs>
-          <w:tab w:val="left" w:pos="13839"/>
+          <w:tab w:val="left" w:pos="8173"/>
         </w:tabs>
         <w:spacing w:after="0"/>
       </w:pPr>
@@ -438,6 +431,7 @@
         <w:spacing w:before="480"/>
       </w:pPr>
       <w:r>
+        <w:lastRenderedPageBreak/>
         <w:t>PURPOSE</w:t>
       </w:r>
     </w:p>
@@ -450,12 +444,7 @@
         </w:numPr>
         <w:ind w:left="720"/>
         <w:rPr>
-          <w:rStyle w:val="cf01"/>
-          <w:rFonts w:asciiTheme="minorBidi" w:eastAsiaTheme="majorEastAsia" w:hAnsiTheme="minorBidi" w:cstheme="minorBidi"/>
-          <w:b w:val="0"/>
-          <w:sz w:val="22"/>
-          <w:szCs w:val="22"/>
-          <w:lang w:bidi="he-IL"/>
+          <w:rFonts w:asciiTheme="minorBidi" w:hAnsiTheme="minorBidi" w:cstheme="minorBidi"/>
         </w:rPr>
       </w:pPr>
       <w:r>
@@ -483,6 +472,18 @@
         </w:rPr>
         <w:t>.</w:t>
       </w:r>
+    </w:p>
+    <w:p>
+      <w:pPr>
+        <w:pStyle w:val="WI-Heading2"/>
+        <w:numPr>
+          <w:ilvl w:val="0"/>
+          <w:numId w:val="0"/>
+        </w:numPr>
+        <w:rPr>
+          <w:rFonts w:eastAsiaTheme="majorEastAsia"/>
+        </w:rPr>
+      </w:pPr>
     </w:p>
     <w:p>
       <w:pPr>
@@ -949,7 +950,6 @@
     </w:p>
     <w:p>
       <w:pPr>
-        <w:ind w:left="720"/>
         <w:rPr>
           <w:color w:val="000000" w:themeColor="text1"/>
         </w:rPr>
@@ -1440,50 +1440,73 @@
         <w:ind w:left="720"/>
         <w:rPr>
           <w:color w:val="000000" w:themeColor="text1"/>
+          <w:szCs w:val="22"/>
         </w:rPr>
       </w:pPr>
       <w:r>
         <w:rPr>
           <w:color w:val="000000" w:themeColor="text1"/>
+          <w:szCs w:val="22"/>
         </w:rPr>
         <w:t>The t</w:t>
       </w:r>
       <w:r>
-        <w:t>est configuration information for this STD can be found in the Software Verification Test Protocol</w:t>
+        <w:rPr>
+          <w:szCs w:val="22"/>
+        </w:rPr>
+        <w:t xml:space="preserve">est configuration information for this </w:t>
       </w:r>
       <w:r>
         <w:rPr>
           <w:color w:val="000000" w:themeColor="text1"/>
+          <w:szCs w:val="22"/>
+        </w:rPr>
+        <w:t>ADD_DOC_STX</w:t>
+      </w:r>
+      <w:r>
+        <w:rPr>
+          <w:szCs w:val="22"/>
         </w:rPr>
         <w:t xml:space="preserve"> </w:t>
       </w:r>
       <w:r>
         <w:rPr>
+          <w:szCs w:val="22"/>
+        </w:rPr>
+        <w:t>can be found in the Software Verification Test Protocol</w:t>
+      </w:r>
+      <w:r>
+        <w:rPr>
           <w:color w:val="000000" w:themeColor="text1"/>
+          <w:szCs w:val="22"/>
+        </w:rPr>
+        <w:t xml:space="preserve"> </w:t>
+      </w:r>
+      <w:r>
+        <w:rPr>
+          <w:color w:val="000000" w:themeColor="text1"/>
+          <w:szCs w:val="22"/>
         </w:rPr>
         <w:t>(</w:t>
       </w:r>
       <w:r>
         <w:rPr>
           <w:color w:val="000000" w:themeColor="text1"/>
-        </w:rPr>
-        <w:t>ADD_PROTOCOL_</w:t>
-      </w:r>
-      <w:proofErr w:type="gramStart"/>
-      <w:r>
-        <w:rPr>
-          <w:color w:val="000000" w:themeColor="text1"/>
-        </w:rPr>
-        <w:t>NUMBER#</w:t>
+          <w:szCs w:val="22"/>
+        </w:rPr>
+        <w:t>ADD_PROTOCOL_NUMBER#</w:t>
       </w:r>
       <w:r>
         <w:rPr>
           <w:color w:val="000000" w:themeColor="text1"/>
+          <w:szCs w:val="22"/>
         </w:rPr>
         <w:t>)</w:t>
       </w:r>
-      <w:proofErr w:type="gramEnd"/>
       <w:r>
+        <w:rPr>
+          <w:szCs w:val="22"/>
+        </w:rPr>
         <w:t>.</w:t>
       </w:r>
     </w:p>
@@ -4443,10 +4466,7 @@
     <w:sectPr>
       <w:headerReference w:type="even" r:id="rId11"/>
       <w:headerReference w:type="default" r:id="rId12"/>
-      <w:footerReference w:type="even" r:id="rId13"/>
-      <w:footerReference w:type="default" r:id="rId14"/>
-      <w:headerReference w:type="first" r:id="rId15"/>
-      <w:footerReference w:type="first" r:id="rId16"/>
+      <w:footerReference w:type="default" r:id="rId13"/>
       <w:pgSz w:w="23818" w:h="16834" w:orient="landscape" w:code="8"/>
       <w:pgMar w:top="1440" w:right="720" w:bottom="1008" w:left="720" w:header="720" w:footer="300" w:gutter="0"/>
       <w:cols w:space="720"/>
@@ -4491,16 +4511,6 @@
 </file>
 
 <file path=word/footer1.xml><?xml version="1.0" encoding="utf-8"?>
-<w:ftr xmlns:wpc="http://schemas.microsoft.com/office/word/2010/wordprocessingCanvas" xmlns:cx="http://schemas.microsoft.com/office/drawing/2014/chartex" xmlns:cx1="http://schemas.microsoft.com/office/drawing/2015/9/8/chartex" xmlns:cx2="http://schemas.microsoft.com/office/drawing/2015/10/21/chartex" xmlns:cx3="http://schemas.microsoft.com/office/drawing/2016/5/9/chartex" xmlns:cx4="http://schemas.microsoft.com/office/drawing/2016/5/10/chartex" xmlns:cx5="http://schemas.microsoft.com/office/drawing/2016/5/11/chartex" xmlns:cx6="http://schemas.microsoft.com/office/drawing/2016/5/12/chartex" xmlns:cx7="http://schemas.microsoft.com/office/drawing/2016/5/13/chartex" xmlns:cx8="http://schemas.microsoft.com/office/drawing/2016/5/14/chartex" xmlns:mc="http://schemas.openxmlformats.org/markup-compatibility/2006" xmlns:aink="http://schemas.microsoft.com/office/drawing/2016/ink" xmlns:am3d="http://schemas.microsoft.com/office/drawing/2017/model3d" xmlns:o="urn:schemas-microsoft-com:office:office" xmlns:oel="http://schemas.microsoft.com/office/2019/extlst" xmlns:r="http://schemas.openxmlformats.org/officeDocument/2006/relationships" xmlns:m="http://schemas.openxmlformats.org/officeDocument/2006/math" xmlns:v="urn:schemas-microsoft-com:vml" xmlns:wp14="http://schemas.microsoft.com/office/word/2010/wordprocessingDrawing" xmlns:wp="http://schemas.openxmlformats.org/drawingml/2006/wordprocessingDrawing" xmlns:w10="urn:schemas-microsoft-com:office:word" xmlns:w="http://schemas.openxmlformats.org/wordprocessingml/2006/main" xmlns:w14="http://schemas.microsoft.com/office/word/2010/wordml" xmlns:w15="http://schemas.microsoft.com/office/word/2012/wordml" xmlns:w16cex="http://schemas.microsoft.com/office/word/2018/wordml/cex" xmlns:w16cid="http://schemas.microsoft.com/office/word/2016/wordml/cid" xmlns:w16="http://schemas.microsoft.com/office/word/2018/wordml" xmlns:w16du="http://schemas.microsoft.com/office/word/2023/wordml/word16du" xmlns:w16sdtdh="http://schemas.microsoft.com/office/word/2020/wordml/sdtdatahash" xmlns:w16sdtfl="http://schemas.microsoft.com/office/word/2024/wordml/sdtformatlock" xmlns:w16se="http://schemas.microsoft.com/office/word/2015/wordml/symex" xmlns:wpg="http://schemas.microsoft.com/office/word/2010/wordprocessingGroup" xmlns:wpi="http://schemas.microsoft.com/office/word/2010/wordprocessingInk" xmlns:wne="http://schemas.microsoft.com/office/word/2006/wordml" xmlns:wps="http://schemas.microsoft.com/office/word/2010/wordprocessingShape" mc:Ignorable="w14 w15 w16se w16cid w16 w16cex w16sdtdh w16sdtfl w16du wp14">
-  <w:p>
-    <w:pPr>
-      <w:pStyle w:val="Footer"/>
-    </w:pPr>
-  </w:p>
-</w:ftr>
-</file>
-
-<file path=word/footer2.xml><?xml version="1.0" encoding="utf-8"?>
 <w:ftr xmlns:wpc="http://schemas.microsoft.com/office/word/2010/wordprocessingCanvas" xmlns:cx="http://schemas.microsoft.com/office/drawing/2014/chartex" xmlns:cx1="http://schemas.microsoft.com/office/drawing/2015/9/8/chartex" xmlns:cx2="http://schemas.microsoft.com/office/drawing/2015/10/21/chartex" xmlns:cx3="http://schemas.microsoft.com/office/drawing/2016/5/9/chartex" xmlns:cx4="http://schemas.microsoft.com/office/drawing/2016/5/10/chartex" xmlns:cx5="http://schemas.microsoft.com/office/drawing/2016/5/11/chartex" xmlns:cx6="http://schemas.microsoft.com/office/drawing/2016/5/12/chartex" xmlns:cx7="http://schemas.microsoft.com/office/drawing/2016/5/13/chartex" xmlns:cx8="http://schemas.microsoft.com/office/drawing/2016/5/14/chartex" xmlns:mc="http://schemas.openxmlformats.org/markup-compatibility/2006" xmlns:aink="http://schemas.microsoft.com/office/drawing/2016/ink" xmlns:am3d="http://schemas.microsoft.com/office/drawing/2017/model3d" xmlns:o="urn:schemas-microsoft-com:office:office" xmlns:oel="http://schemas.microsoft.com/office/2019/extlst" xmlns:r="http://schemas.openxmlformats.org/officeDocument/2006/relationships" xmlns:m="http://schemas.openxmlformats.org/officeDocument/2006/math" xmlns:v="urn:schemas-microsoft-com:vml" xmlns:wp14="http://schemas.microsoft.com/office/word/2010/wordprocessingDrawing" xmlns:wp="http://schemas.openxmlformats.org/drawingml/2006/wordprocessingDrawing" xmlns:w10="urn:schemas-microsoft-com:office:word" xmlns:w="http://schemas.openxmlformats.org/wordprocessingml/2006/main" xmlns:w14="http://schemas.microsoft.com/office/word/2010/wordml" xmlns:w15="http://schemas.microsoft.com/office/word/2012/wordml" xmlns:w16cex="http://schemas.microsoft.com/office/word/2018/wordml/cex" xmlns:w16cid="http://schemas.microsoft.com/office/word/2016/wordml/cid" xmlns:w16="http://schemas.microsoft.com/office/word/2018/wordml" xmlns:w16du="http://schemas.microsoft.com/office/word/2023/wordml/word16du" xmlns:w16sdtdh="http://schemas.microsoft.com/office/word/2020/wordml/sdtdatahash" xmlns:w16sdtfl="http://schemas.microsoft.com/office/word/2024/wordml/sdtformatlock" xmlns:w16se="http://schemas.microsoft.com/office/word/2015/wordml/symex" xmlns:wpg="http://schemas.microsoft.com/office/word/2010/wordprocessingGroup" xmlns:wpi="http://schemas.microsoft.com/office/word/2010/wordprocessingInk" xmlns:wne="http://schemas.microsoft.com/office/word/2006/wordml" xmlns:wps="http://schemas.microsoft.com/office/word/2010/wordprocessingShape" mc:Ignorable="w14 w15 w16se w16cid w16 w16cex w16sdtdh w16sdtfl w16du wp14">
   <w:tbl>
     <w:tblPr>
@@ -4594,27 +4604,6 @@
             </w:rPr>
             <w:t>ADD_FOOTER</w:t>
           </w:r>
-          <w:r>
-            <w:rPr>
-              <w:rFonts w:eastAsia="Times New Roman"/>
-              <w:color w:val="auto"/>
-              <w:spacing w:val="-4"/>
-              <w:sz w:val="17"/>
-              <w:szCs w:val="17"/>
-            </w:rPr>
-            <w:t xml:space="preserve"> </w:t>
-          </w:r>
-          <w:r>
-            <w:rPr>
-              <w:rFonts w:eastAsia="Times New Roman"/>
-              <w:color w:val="auto"/>
-              <w:spacing w:val="-4"/>
-              <w:sz w:val="17"/>
-              <w:szCs w:val="17"/>
-              <w:highlight w:val="lightGray"/>
-            </w:rPr>
-            <w:t>6</w:t>
-          </w:r>
         </w:p>
       </w:tc>
       <w:tc>
@@ -4704,16 +4693,6 @@
       </w:rPr>
       <w:t>Verify revision is current prior to use.</w:t>
     </w:r>
-  </w:p>
-</w:ftr>
-</file>
-
-<file path=word/footer3.xml><?xml version="1.0" encoding="utf-8"?>
-<w:ftr xmlns:wpc="http://schemas.microsoft.com/office/word/2010/wordprocessingCanvas" xmlns:cx="http://schemas.microsoft.com/office/drawing/2014/chartex" xmlns:cx1="http://schemas.microsoft.com/office/drawing/2015/9/8/chartex" xmlns:cx2="http://schemas.microsoft.com/office/drawing/2015/10/21/chartex" xmlns:cx3="http://schemas.microsoft.com/office/drawing/2016/5/9/chartex" xmlns:cx4="http://schemas.microsoft.com/office/drawing/2016/5/10/chartex" xmlns:cx5="http://schemas.microsoft.com/office/drawing/2016/5/11/chartex" xmlns:cx6="http://schemas.microsoft.com/office/drawing/2016/5/12/chartex" xmlns:cx7="http://schemas.microsoft.com/office/drawing/2016/5/13/chartex" xmlns:cx8="http://schemas.microsoft.com/office/drawing/2016/5/14/chartex" xmlns:mc="http://schemas.openxmlformats.org/markup-compatibility/2006" xmlns:aink="http://schemas.microsoft.com/office/drawing/2016/ink" xmlns:am3d="http://schemas.microsoft.com/office/drawing/2017/model3d" xmlns:o="urn:schemas-microsoft-com:office:office" xmlns:oel="http://schemas.microsoft.com/office/2019/extlst" xmlns:r="http://schemas.openxmlformats.org/officeDocument/2006/relationships" xmlns:m="http://schemas.openxmlformats.org/officeDocument/2006/math" xmlns:v="urn:schemas-microsoft-com:vml" xmlns:wp14="http://schemas.microsoft.com/office/word/2010/wordprocessingDrawing" xmlns:wp="http://schemas.openxmlformats.org/drawingml/2006/wordprocessingDrawing" xmlns:w10="urn:schemas-microsoft-com:office:word" xmlns:w="http://schemas.openxmlformats.org/wordprocessingml/2006/main" xmlns:w14="http://schemas.microsoft.com/office/word/2010/wordml" xmlns:w15="http://schemas.microsoft.com/office/word/2012/wordml" xmlns:w16cex="http://schemas.microsoft.com/office/word/2018/wordml/cex" xmlns:w16cid="http://schemas.microsoft.com/office/word/2016/wordml/cid" xmlns:w16="http://schemas.microsoft.com/office/word/2018/wordml" xmlns:w16du="http://schemas.microsoft.com/office/word/2023/wordml/word16du" xmlns:w16sdtdh="http://schemas.microsoft.com/office/word/2020/wordml/sdtdatahash" xmlns:w16sdtfl="http://schemas.microsoft.com/office/word/2024/wordml/sdtformatlock" xmlns:w16se="http://schemas.microsoft.com/office/word/2015/wordml/symex" xmlns:wpg="http://schemas.microsoft.com/office/word/2010/wordprocessingGroup" xmlns:wpi="http://schemas.microsoft.com/office/word/2010/wordprocessingInk" xmlns:wne="http://schemas.microsoft.com/office/word/2006/wordml" xmlns:wps="http://schemas.microsoft.com/office/word/2010/wordprocessingShape" mc:Ignorable="w14 w15 w16se w16cid w16 w16cex w16sdtdh w16sdtfl w16du wp14">
-  <w:p>
-    <w:pPr>
-      <w:pStyle w:val="Footer"/>
-    </w:pPr>
   </w:p>
 </w:ftr>
 </file>
@@ -5167,16 +5146,6 @@
   <w:p>
     <w:pPr>
       <w:spacing w:after="0"/>
-    </w:pPr>
-  </w:p>
-</w:hdr>
-</file>
-
-<file path=word/header3.xml><?xml version="1.0" encoding="utf-8"?>
-<w:hdr xmlns:wpc="http://schemas.microsoft.com/office/word/2010/wordprocessingCanvas" xmlns:cx="http://schemas.microsoft.com/office/drawing/2014/chartex" xmlns:cx1="http://schemas.microsoft.com/office/drawing/2015/9/8/chartex" xmlns:cx2="http://schemas.microsoft.com/office/drawing/2015/10/21/chartex" xmlns:cx3="http://schemas.microsoft.com/office/drawing/2016/5/9/chartex" xmlns:cx4="http://schemas.microsoft.com/office/drawing/2016/5/10/chartex" xmlns:cx5="http://schemas.microsoft.com/office/drawing/2016/5/11/chartex" xmlns:cx6="http://schemas.microsoft.com/office/drawing/2016/5/12/chartex" xmlns:cx7="http://schemas.microsoft.com/office/drawing/2016/5/13/chartex" xmlns:cx8="http://schemas.microsoft.com/office/drawing/2016/5/14/chartex" xmlns:mc="http://schemas.openxmlformats.org/markup-compatibility/2006" xmlns:aink="http://schemas.microsoft.com/office/drawing/2016/ink" xmlns:am3d="http://schemas.microsoft.com/office/drawing/2017/model3d" xmlns:o="urn:schemas-microsoft-com:office:office" xmlns:oel="http://schemas.microsoft.com/office/2019/extlst" xmlns:r="http://schemas.openxmlformats.org/officeDocument/2006/relationships" xmlns:m="http://schemas.openxmlformats.org/officeDocument/2006/math" xmlns:v="urn:schemas-microsoft-com:vml" xmlns:wp14="http://schemas.microsoft.com/office/word/2010/wordprocessingDrawing" xmlns:wp="http://schemas.openxmlformats.org/drawingml/2006/wordprocessingDrawing" xmlns:w10="urn:schemas-microsoft-com:office:word" xmlns:w="http://schemas.openxmlformats.org/wordprocessingml/2006/main" xmlns:w14="http://schemas.microsoft.com/office/word/2010/wordml" xmlns:w15="http://schemas.microsoft.com/office/word/2012/wordml" xmlns:w16cex="http://schemas.microsoft.com/office/word/2018/wordml/cex" xmlns:w16cid="http://schemas.microsoft.com/office/word/2016/wordml/cid" xmlns:w16="http://schemas.microsoft.com/office/word/2018/wordml" xmlns:w16du="http://schemas.microsoft.com/office/word/2023/wordml/word16du" xmlns:w16sdtdh="http://schemas.microsoft.com/office/word/2020/wordml/sdtdatahash" xmlns:w16sdtfl="http://schemas.microsoft.com/office/word/2024/wordml/sdtformatlock" xmlns:w16se="http://schemas.microsoft.com/office/word/2015/wordml/symex" xmlns:wpg="http://schemas.microsoft.com/office/word/2010/wordprocessingGroup" xmlns:wpi="http://schemas.microsoft.com/office/word/2010/wordprocessingInk" xmlns:wne="http://schemas.microsoft.com/office/word/2006/wordml" xmlns:wps="http://schemas.microsoft.com/office/word/2010/wordprocessingShape" mc:Ignorable="w14 w15 w16se w16cid w16 w16cex w16sdtdh w16sdtfl w16du wp14">
-  <w:p>
-    <w:pPr>
-      <w:pStyle w:val="Header"/>
     </w:pPr>
   </w:p>
 </w:hdr>
@@ -6842,15 +6811,6 @@
 </file>
 
 <file path=customXml/item1.xml><?xml version="1.0" encoding="utf-8"?>
-<?mso-contentType ?>
-<FormTemplates xmlns="http://schemas.microsoft.com/sharepoint/v3/contenttype/forms">
-  <Display>DocumentLibraryForm</Display>
-  <Edit>DocumentLibraryForm</Edit>
-  <New>DocumentLibraryForm</New>
-</FormTemplates>
-</file>
-
-<file path=customXml/item2.xml><?xml version="1.0" encoding="utf-8"?>
 <ct:contentTypeSchema xmlns:ct="http://schemas.microsoft.com/office/2006/metadata/contentType" xmlns:ma="http://schemas.microsoft.com/office/2006/metadata/properties/metaAttributes" ct:_="" ma:_="" ma:contentTypeName="Document" ma:contentTypeID="0x010100E003BFD05FFA2D42BA6AD57B3B47D0AA" ma:contentTypeVersion="4" ma:contentTypeDescription="Create a new document." ma:contentTypeScope="" ma:versionID="a27d43316dc3f32d2b50f96429073c55">
   <xsd:schema xmlns:xsd="http://www.w3.org/2001/XMLSchema" xmlns:xs="http://www.w3.org/2001/XMLSchema" xmlns:p="http://schemas.microsoft.com/office/2006/metadata/properties" xmlns:ns2="11b614b0-1e2e-49d8-87d3-b3bb2a9b761e" targetNamespace="http://schemas.microsoft.com/office/2006/metadata/properties" ma:root="true" ma:fieldsID="478ba03fecc8454ee4bd8e5ef989c97f" ns2:_="">
     <xsd:import namespace="11b614b0-1e2e-49d8-87d3-b3bb2a9b761e"/>
@@ -6994,25 +6954,26 @@
 </ct:contentTypeSchema>
 </file>
 
-<file path=customXml/item3.xml><?xml version="1.0" encoding="utf-8"?>
-<b:Sources xmlns:b="http://schemas.openxmlformats.org/officeDocument/2006/bibliography" xmlns="http://schemas.openxmlformats.org/officeDocument/2006/bibliography" SelectedStyle="\APASixthEditionOfficeOnline.xsl" StyleName="APA" Version="6"/>
+<file path=customXml/item2.xml><?xml version="1.0" encoding="utf-8"?>
+<?mso-contentType ?>
+<FormTemplates xmlns="http://schemas.microsoft.com/sharepoint/v3/contenttype/forms">
+  <Display>DocumentLibraryForm</Display>
+  <Edit>DocumentLibraryForm</Edit>
+  <New>DocumentLibraryForm</New>
+</FormTemplates>
 </file>
 
-<file path=customXml/item4.xml><?xml version="1.0" encoding="utf-8"?>
+<file path=customXml/item3.xml><?xml version="1.0" encoding="utf-8"?>
 <p:properties xmlns:p="http://schemas.microsoft.com/office/2006/metadata/properties" xmlns:xsi="http://www.w3.org/2001/XMLSchema-instance" xmlns:pc="http://schemas.microsoft.com/office/infopath/2007/PartnerControls">
   <documentManagement/>
 </p:properties>
 </file>
 
-<file path=customXml/itemProps1.xml><?xml version="1.0" encoding="utf-8"?>
-<ds:datastoreItem xmlns:ds="http://schemas.openxmlformats.org/officeDocument/2006/customXml" ds:itemID="{E6B069D2-3F25-4D75-8C56-FA3DA451B105}">
-  <ds:schemaRefs>
-    <ds:schemaRef ds:uri="http://schemas.microsoft.com/sharepoint/v3/contenttype/forms"/>
-  </ds:schemaRefs>
-</ds:datastoreItem>
+<file path=customXml/item4.xml><?xml version="1.0" encoding="utf-8"?>
+<b:Sources xmlns:b="http://schemas.openxmlformats.org/officeDocument/2006/bibliography" xmlns="http://schemas.openxmlformats.org/officeDocument/2006/bibliography" SelectedStyle="\APASixthEditionOfficeOnline.xsl" StyleName="APA" Version="6"/>
 </file>
 
-<file path=customXml/itemProps2.xml><?xml version="1.0" encoding="utf-8"?>
+<file path=customXml/itemProps1.xml><?xml version="1.0" encoding="utf-8"?>
 <ds:datastoreItem xmlns:ds="http://schemas.openxmlformats.org/officeDocument/2006/customXml" ds:itemID="{0F70CE26-BC8B-45A9-8DC0-10B9E8AB7F0F}">
   <ds:schemaRefs>
     <ds:schemaRef ds:uri="http://schemas.microsoft.com/office/2006/metadata/contentType"/>
@@ -7030,19 +6991,27 @@
 </ds:datastoreItem>
 </file>
 
+<file path=customXml/itemProps2.xml><?xml version="1.0" encoding="utf-8"?>
+<ds:datastoreItem xmlns:ds="http://schemas.openxmlformats.org/officeDocument/2006/customXml" ds:itemID="{E6B069D2-3F25-4D75-8C56-FA3DA451B105}">
+  <ds:schemaRefs>
+    <ds:schemaRef ds:uri="http://schemas.microsoft.com/sharepoint/v3/contenttype/forms"/>
+  </ds:schemaRefs>
+</ds:datastoreItem>
+</file>
+
 <file path=customXml/itemProps3.xml><?xml version="1.0" encoding="utf-8"?>
-<ds:datastoreItem xmlns:ds="http://schemas.openxmlformats.org/officeDocument/2006/customXml" ds:itemID="{51C305F4-FC42-44BF-937D-622594B759D6}">
+<ds:datastoreItem xmlns:ds="http://schemas.openxmlformats.org/officeDocument/2006/customXml" ds:itemID="{1E465B3E-184E-47C3-ADC7-5E2EE4588295}">
   <ds:schemaRefs>
-    <ds:schemaRef ds:uri="http://schemas.openxmlformats.org/officeDocument/2006/bibliography"/>
+    <ds:schemaRef ds:uri="http://schemas.microsoft.com/office/2006/metadata/properties"/>
+    <ds:schemaRef ds:uri="http://schemas.microsoft.com/office/infopath/2007/PartnerControls"/>
   </ds:schemaRefs>
 </ds:datastoreItem>
 </file>
 
 <file path=customXml/itemProps4.xml><?xml version="1.0" encoding="utf-8"?>
-<ds:datastoreItem xmlns:ds="http://schemas.openxmlformats.org/officeDocument/2006/customXml" ds:itemID="{1E465B3E-184E-47C3-ADC7-5E2EE4588295}">
+<ds:datastoreItem xmlns:ds="http://schemas.openxmlformats.org/officeDocument/2006/customXml" ds:itemID="{51C305F4-FC42-44BF-937D-622594B759D6}">
   <ds:schemaRefs>
-    <ds:schemaRef ds:uri="http://schemas.microsoft.com/office/2006/metadata/properties"/>
-    <ds:schemaRef ds:uri="http://schemas.microsoft.com/office/infopath/2007/PartnerControls"/>
+    <ds:schemaRef ds:uri="http://schemas.openxmlformats.org/officeDocument/2006/bibliography"/>
   </ds:schemaRefs>
 </ds:datastoreItem>
 </file>

</xml_diff>